<commit_message>
Include all figures (13 PNGs) inline in the manuscript
- Forest plots (SGA/FGR, Biometry/EFW, RCT MD) after each results section
- Study characteristics, quality heatmap, LOO sensitivity, funnel plot
- GRADE profile, narrative synthesis, bubble plot, outcome summary
- Each figure with formatted caption (bold label + italic description)

Co-Authored-By: Claude Opus 4.6 (1M context) <noreply@anthropic.com>
</commit_message>
<xml_diff>
--- a/Manuscript_VitaminD_SR_Lancet.docx
+++ b/Manuscript_VitaminD_SR_Lancet.docx
@@ -615,6 +615,132 @@
     </w:p>
     <w:p>
       <w:pPr>
+        <w:jc w:val="center"/>
+      </w:pPr>
+      <w:r>
+        <w:drawing>
+          <wp:inline xmlns:a="http://schemas.openxmlformats.org/drawingml/2006/main" xmlns:pic="http://schemas.openxmlformats.org/drawingml/2006/picture">
+            <wp:extent cx="5943600" cy="4358640"/>
+            <wp:docPr id="1" name="Picture 1"/>
+            <wp:cNvGraphicFramePr>
+              <a:graphicFrameLocks noChangeAspect="1"/>
+            </wp:cNvGraphicFramePr>
+            <a:graphic>
+              <a:graphicData uri="http://schemas.openxmlformats.org/drawingml/2006/picture">
+                <pic:pic>
+                  <pic:nvPicPr>
+                    <pic:cNvPr id="0" name="StudyCharacteristics.png"/>
+                    <pic:cNvPicPr/>
+                  </pic:nvPicPr>
+                  <pic:blipFill>
+                    <a:blip r:embed="rId9"/>
+                    <a:stretch>
+                      <a:fillRect/>
+                    </a:stretch>
+                  </pic:blipFill>
+                  <pic:spPr>
+                    <a:xfrm>
+                      <a:off x="0" y="0"/>
+                      <a:ext cx="5943600" cy="4358640"/>
+                    </a:xfrm>
+                    <a:prstGeom prst="rect"/>
+                  </pic:spPr>
+                </pic:pic>
+              </a:graphicData>
+            </a:graphic>
+          </wp:inline>
+        </w:drawing>
+      </w:r>
+    </w:p>
+    <w:p>
+      <w:pPr>
+        <w:spacing w:before="80" w:after="280"/>
+        <w:jc w:val="left"/>
+      </w:pPr>
+      <w:r>
+        <w:rPr>
+          <w:rFonts w:ascii="Times New Roman" w:hAnsi="Times New Roman"/>
+          <w:b/>
+          <w:i w:val="0"/>
+          <w:sz w:val="20"/>
+        </w:rPr>
+        <w:t xml:space="preserve">Figure 1. </w:t>
+      </w:r>
+      <w:r>
+        <w:rPr>
+          <w:rFonts w:ascii="Times New Roman" w:hAnsi="Times New Roman"/>
+          <w:b w:val="0"/>
+          <w:i/>
+          <w:sz w:val="20"/>
+        </w:rPr>
+        <w:t>Characteristics of included studies (k = 26): (a) study design, (b) publication timeline, (c) geographic distribution, (d) methodological quality (NOS).</w:t>
+      </w:r>
+    </w:p>
+    <w:p>
+      <w:pPr>
+        <w:jc w:val="center"/>
+      </w:pPr>
+      <w:r>
+        <w:drawing>
+          <wp:inline xmlns:a="http://schemas.openxmlformats.org/drawingml/2006/main" xmlns:pic="http://schemas.openxmlformats.org/drawingml/2006/picture">
+            <wp:extent cx="5943600" cy="2759529"/>
+            <wp:docPr id="2" name="Picture 2"/>
+            <wp:cNvGraphicFramePr>
+              <a:graphicFrameLocks noChangeAspect="1"/>
+            </wp:cNvGraphicFramePr>
+            <a:graphic>
+              <a:graphicData uri="http://schemas.openxmlformats.org/drawingml/2006/picture">
+                <pic:pic>
+                  <pic:nvPicPr>
+                    <pic:cNvPr id="0" name="LabMethods_VitD.png"/>
+                    <pic:cNvPicPr/>
+                  </pic:nvPicPr>
+                  <pic:blipFill>
+                    <a:blip r:embed="rId10"/>
+                    <a:stretch>
+                      <a:fillRect/>
+                    </a:stretch>
+                  </pic:blipFill>
+                  <pic:spPr>
+                    <a:xfrm>
+                      <a:off x="0" y="0"/>
+                      <a:ext cx="5943600" cy="2759529"/>
+                    </a:xfrm>
+                    <a:prstGeom prst="rect"/>
+                  </pic:spPr>
+                </pic:pic>
+              </a:graphicData>
+            </a:graphic>
+          </wp:inline>
+        </w:drawing>
+      </w:r>
+    </w:p>
+    <w:p>
+      <w:pPr>
+        <w:spacing w:before="80" w:after="280"/>
+        <w:jc w:val="left"/>
+      </w:pPr>
+      <w:r>
+        <w:rPr>
+          <w:rFonts w:ascii="Times New Roman" w:hAnsi="Times New Roman"/>
+          <w:b/>
+          <w:i w:val="0"/>
+          <w:sz w:val="20"/>
+        </w:rPr>
+        <w:t xml:space="preserve">Figure S9. </w:t>
+      </w:r>
+      <w:r>
+        <w:rPr>
+          <w:rFonts w:ascii="Times New Roman" w:hAnsi="Times New Roman"/>
+          <w:b w:val="0"/>
+          <w:i/>
+          <w:sz w:val="20"/>
+        </w:rPr>
+        <w:t>(a) Laboratory methods for 25(OH)D quantification across studies. (b) Maternal 25(OH)D concentrations by continent. Dashed red line = 50 nmol/L sufficiency threshold.</w:t>
+      </w:r>
+    </w:p>
+    <w:p>
+      <w:pPr>
         <w:pStyle w:val="Heading2"/>
       </w:pPr>
       <w:r>
@@ -652,6 +778,69 @@
     </w:p>
     <w:p>
       <w:pPr>
+        <w:jc w:val="center"/>
+      </w:pPr>
+      <w:r>
+        <w:drawing>
+          <wp:inline xmlns:a="http://schemas.openxmlformats.org/drawingml/2006/main" xmlns:pic="http://schemas.openxmlformats.org/drawingml/2006/picture">
+            <wp:extent cx="5943600" cy="4086225"/>
+            <wp:docPr id="3" name="Picture 3"/>
+            <wp:cNvGraphicFramePr>
+              <a:graphicFrameLocks noChangeAspect="1"/>
+            </wp:cNvGraphicFramePr>
+            <a:graphic>
+              <a:graphicData uri="http://schemas.openxmlformats.org/drawingml/2006/picture">
+                <pic:pic>
+                  <pic:nvPicPr>
+                    <pic:cNvPr id="0" name="Quality_JBI_NOS.png"/>
+                    <pic:cNvPicPr/>
+                  </pic:nvPicPr>
+                  <pic:blipFill>
+                    <a:blip r:embed="rId11"/>
+                    <a:stretch>
+                      <a:fillRect/>
+                    </a:stretch>
+                  </pic:blipFill>
+                  <pic:spPr>
+                    <a:xfrm>
+                      <a:off x="0" y="0"/>
+                      <a:ext cx="5943600" cy="4086225"/>
+                    </a:xfrm>
+                    <a:prstGeom prst="rect"/>
+                  </pic:spPr>
+                </pic:pic>
+              </a:graphicData>
+            </a:graphic>
+          </wp:inline>
+        </w:drawing>
+      </w:r>
+    </w:p>
+    <w:p>
+      <w:pPr>
+        <w:spacing w:before="80" w:after="280"/>
+        <w:jc w:val="left"/>
+      </w:pPr>
+      <w:r>
+        <w:rPr>
+          <w:rFonts w:ascii="Times New Roman" w:hAnsi="Times New Roman"/>
+          <w:b/>
+          <w:i w:val="0"/>
+          <w:sz w:val="20"/>
+        </w:rPr>
+        <w:t xml:space="preserve">Figure S1. </w:t>
+      </w:r>
+      <w:r>
+        <w:rPr>
+          <w:rFonts w:ascii="Times New Roman" w:hAnsi="Times New Roman"/>
+          <w:b w:val="0"/>
+          <w:i/>
+          <w:sz w:val="20"/>
+        </w:rPr>
+        <w:t>Methodological quality assessment. (a) JBI Critical Appraisal heatmap (Q1–Q9) for 24 observational studies. (b) Newcastle–Ottawa Scale scores. Dashed red line = NOS ≥ 7 (high quality threshold).</w:t>
+      </w:r>
+    </w:p>
+    <w:p>
+      <w:pPr>
         <w:pStyle w:val="Heading2"/>
       </w:pPr>
       <w:r>
@@ -689,6 +878,69 @@
     </w:p>
     <w:p>
       <w:pPr>
+        <w:jc w:val="center"/>
+      </w:pPr>
+      <w:r>
+        <w:drawing>
+          <wp:inline xmlns:a="http://schemas.openxmlformats.org/drawingml/2006/main" xmlns:pic="http://schemas.openxmlformats.org/drawingml/2006/picture">
+            <wp:extent cx="5943600" cy="1857375"/>
+            <wp:docPr id="4" name="Picture 4"/>
+            <wp:cNvGraphicFramePr>
+              <a:graphicFrameLocks noChangeAspect="1"/>
+            </wp:cNvGraphicFramePr>
+            <a:graphic>
+              <a:graphicData uri="http://schemas.openxmlformats.org/drawingml/2006/picture">
+                <pic:pic>
+                  <pic:nvPicPr>
+                    <pic:cNvPr id="0" name="Forest_SGA_FGR.png"/>
+                    <pic:cNvPicPr/>
+                  </pic:nvPicPr>
+                  <pic:blipFill>
+                    <a:blip r:embed="rId12"/>
+                    <a:stretch>
+                      <a:fillRect/>
+                    </a:stretch>
+                  </pic:blipFill>
+                  <pic:spPr>
+                    <a:xfrm>
+                      <a:off x="0" y="0"/>
+                      <a:ext cx="5943600" cy="1857375"/>
+                    </a:xfrm>
+                    <a:prstGeom prst="rect"/>
+                  </pic:spPr>
+                </pic:pic>
+              </a:graphicData>
+            </a:graphic>
+          </wp:inline>
+        </w:drawing>
+      </w:r>
+    </w:p>
+    <w:p>
+      <w:pPr>
+        <w:spacing w:before="80" w:after="280"/>
+        <w:jc w:val="left"/>
+      </w:pPr>
+      <w:r>
+        <w:rPr>
+          <w:rFonts w:ascii="Times New Roman" w:hAnsi="Times New Roman"/>
+          <w:b/>
+          <w:i w:val="0"/>
+          <w:sz w:val="20"/>
+        </w:rPr>
+        <w:t xml:space="preserve">Figure 2. </w:t>
+      </w:r>
+      <w:r>
+        <w:rPr>
+          <w:rFonts w:ascii="Times New Roman" w:hAnsi="Times New Roman"/>
+          <w:b w:val="0"/>
+          <w:i/>
+          <w:sz w:val="20"/>
+        </w:rPr>
+        <w:t>Forest plot: association between maternal vitamin D deficiency and SGA/FGR (k = 4; N = 9,033). Fixed-effects model; pooled OR = 1·95 (95% CI 1·47–2·59); I² = 0%. † Direction inverted to harmonise deficiency as increased risk.</w:t>
+      </w:r>
+    </w:p>
+    <w:p>
+      <w:pPr>
         <w:pStyle w:val="Heading2"/>
       </w:pPr>
       <w:r>
@@ -740,6 +992,132 @@
     </w:p>
     <w:p>
       <w:pPr>
+        <w:jc w:val="center"/>
+      </w:pPr>
+      <w:r>
+        <w:drawing>
+          <wp:inline xmlns:a="http://schemas.openxmlformats.org/drawingml/2006/main" xmlns:pic="http://schemas.openxmlformats.org/drawingml/2006/picture">
+            <wp:extent cx="5029200" cy="2095500"/>
+            <wp:docPr id="5" name="Picture 5"/>
+            <wp:cNvGraphicFramePr>
+              <a:graphicFrameLocks noChangeAspect="1"/>
+            </wp:cNvGraphicFramePr>
+            <a:graphic>
+              <a:graphicData uri="http://schemas.openxmlformats.org/drawingml/2006/picture">
+                <pic:pic>
+                  <pic:nvPicPr>
+                    <pic:cNvPr id="0" name="LOO_Sensitivity.png"/>
+                    <pic:cNvPicPr/>
+                  </pic:nvPicPr>
+                  <pic:blipFill>
+                    <a:blip r:embed="rId13"/>
+                    <a:stretch>
+                      <a:fillRect/>
+                    </a:stretch>
+                  </pic:blipFill>
+                  <pic:spPr>
+                    <a:xfrm>
+                      <a:off x="0" y="0"/>
+                      <a:ext cx="5029200" cy="2095500"/>
+                    </a:xfrm>
+                    <a:prstGeom prst="rect"/>
+                  </pic:spPr>
+                </pic:pic>
+              </a:graphicData>
+            </a:graphic>
+          </wp:inline>
+        </w:drawing>
+      </w:r>
+    </w:p>
+    <w:p>
+      <w:pPr>
+        <w:spacing w:before="80" w:after="280"/>
+        <w:jc w:val="left"/>
+      </w:pPr>
+      <w:r>
+        <w:rPr>
+          <w:rFonts w:ascii="Times New Roman" w:hAnsi="Times New Roman"/>
+          <w:b/>
+          <w:i w:val="0"/>
+          <w:sz w:val="20"/>
+        </w:rPr>
+        <w:t xml:space="preserve">Figure S2. </w:t>
+      </w:r>
+      <w:r>
+        <w:rPr>
+          <w:rFonts w:ascii="Times New Roman" w:hAnsi="Times New Roman"/>
+          <w:b w:val="0"/>
+          <w:i/>
+          <w:sz w:val="20"/>
+        </w:rPr>
+        <w:t>Leave-one-out sensitivity analysis for SGA/FGR. All estimates remain statistically significant. Dashed line = overall pooled estimate.</w:t>
+      </w:r>
+    </w:p>
+    <w:p>
+      <w:pPr>
+        <w:jc w:val="center"/>
+      </w:pPr>
+      <w:r>
+        <w:drawing>
+          <wp:inline xmlns:a="http://schemas.openxmlformats.org/drawingml/2006/main" xmlns:pic="http://schemas.openxmlformats.org/drawingml/2006/picture">
+            <wp:extent cx="5029200" cy="2305050"/>
+            <wp:docPr id="6" name="Picture 6"/>
+            <wp:cNvGraphicFramePr>
+              <a:graphicFrameLocks noChangeAspect="1"/>
+            </wp:cNvGraphicFramePr>
+            <a:graphic>
+              <a:graphicData uri="http://schemas.openxmlformats.org/drawingml/2006/picture">
+                <pic:pic>
+                  <pic:nvPicPr>
+                    <pic:cNvPr id="0" name="Cutoff_Subgroup.png"/>
+                    <pic:cNvPicPr/>
+                  </pic:nvPicPr>
+                  <pic:blipFill>
+                    <a:blip r:embed="rId14"/>
+                    <a:stretch>
+                      <a:fillRect/>
+                    </a:stretch>
+                  </pic:blipFill>
+                  <pic:spPr>
+                    <a:xfrm>
+                      <a:off x="0" y="0"/>
+                      <a:ext cx="5029200" cy="2305050"/>
+                    </a:xfrm>
+                    <a:prstGeom prst="rect"/>
+                  </pic:spPr>
+                </pic:pic>
+              </a:graphicData>
+            </a:graphic>
+          </wp:inline>
+        </w:drawing>
+      </w:r>
+    </w:p>
+    <w:p>
+      <w:pPr>
+        <w:spacing w:before="80" w:after="280"/>
+        <w:jc w:val="left"/>
+      </w:pPr>
+      <w:r>
+        <w:rPr>
+          <w:rFonts w:ascii="Times New Roman" w:hAnsi="Times New Roman"/>
+          <w:b/>
+          <w:i w:val="0"/>
+          <w:sz w:val="20"/>
+        </w:rPr>
+        <w:t xml:space="preserve">Figure S3. </w:t>
+      </w:r>
+      <w:r>
+        <w:rPr>
+          <w:rFonts w:ascii="Times New Roman" w:hAnsi="Times New Roman"/>
+          <w:b w:val="0"/>
+          <w:i/>
+          <w:sz w:val="20"/>
+        </w:rPr>
+        <w:t>Subgroup forest plot by vitamin D deficiency threshold. All subgroups directionally consistent.</w:t>
+      </w:r>
+    </w:p>
+    <w:p>
+      <w:pPr>
         <w:pStyle w:val="Heading2"/>
       </w:pPr>
       <w:r>
@@ -777,6 +1155,69 @@
     </w:p>
     <w:p>
       <w:pPr>
+        <w:jc w:val="center"/>
+      </w:pPr>
+      <w:r>
+        <w:drawing>
+          <wp:inline xmlns:a="http://schemas.openxmlformats.org/drawingml/2006/main" xmlns:pic="http://schemas.openxmlformats.org/drawingml/2006/picture">
+            <wp:extent cx="5943600" cy="2179320"/>
+            <wp:docPr id="7" name="Picture 7"/>
+            <wp:cNvGraphicFramePr>
+              <a:graphicFrameLocks noChangeAspect="1"/>
+            </wp:cNvGraphicFramePr>
+            <a:graphic>
+              <a:graphicData uri="http://schemas.openxmlformats.org/drawingml/2006/picture">
+                <pic:pic>
+                  <pic:nvPicPr>
+                    <pic:cNvPr id="0" name="Forest_Biometry_EFW.png"/>
+                    <pic:cNvPicPr/>
+                  </pic:nvPicPr>
+                  <pic:blipFill>
+                    <a:blip r:embed="rId15"/>
+                    <a:stretch>
+                      <a:fillRect/>
+                    </a:stretch>
+                  </pic:blipFill>
+                  <pic:spPr>
+                    <a:xfrm>
+                      <a:off x="0" y="0"/>
+                      <a:ext cx="5943600" cy="2179320"/>
+                    </a:xfrm>
+                    <a:prstGeom prst="rect"/>
+                  </pic:spPr>
+                </pic:pic>
+              </a:graphicData>
+            </a:graphic>
+          </wp:inline>
+        </w:drawing>
+      </w:r>
+    </w:p>
+    <w:p>
+      <w:pPr>
+        <w:spacing w:before="80" w:after="280"/>
+        <w:jc w:val="left"/>
+      </w:pPr>
+      <w:r>
+        <w:rPr>
+          <w:rFonts w:ascii="Times New Roman" w:hAnsi="Times New Roman"/>
+          <w:b/>
+          <w:i w:val="0"/>
+          <w:sz w:val="20"/>
+        </w:rPr>
+        <w:t xml:space="preserve">Figure 3. </w:t>
+      </w:r>
+      <w:r>
+        <w:rPr>
+          <w:rFonts w:ascii="Times New Roman" w:hAnsi="Times New Roman"/>
+          <w:b w:val="0"/>
+          <w:i/>
+          <w:sz w:val="20"/>
+        </w:rPr>
+        <w:t>Forest plot: association between maternal vitamin D deficiency and fetal biometry/EFW (k = 4; N = 26,542). Fixed-effects model; pooled OR = 1·16 (95% CI 1·09–1·23); I² = 33%.</w:t>
+      </w:r>
+    </w:p>
+    <w:p>
+      <w:pPr>
         <w:pStyle w:val="Heading2"/>
       </w:pPr>
       <w:r>
@@ -814,6 +1255,69 @@
     </w:p>
     <w:p>
       <w:pPr>
+        <w:jc w:val="center"/>
+      </w:pPr>
+      <w:r>
+        <w:drawing>
+          <wp:inline xmlns:a="http://schemas.openxmlformats.org/drawingml/2006/main" xmlns:pic="http://schemas.openxmlformats.org/drawingml/2006/picture">
+            <wp:extent cx="5943600" cy="2179320"/>
+            <wp:docPr id="8" name="Picture 8"/>
+            <wp:cNvGraphicFramePr>
+              <a:graphicFrameLocks noChangeAspect="1"/>
+            </wp:cNvGraphicFramePr>
+            <a:graphic>
+              <a:graphicData uri="http://schemas.openxmlformats.org/drawingml/2006/picture">
+                <pic:pic>
+                  <pic:nvPicPr>
+                    <pic:cNvPr id="0" name="Forest_RCT_MD.png"/>
+                    <pic:cNvPicPr/>
+                  </pic:nvPicPr>
+                  <pic:blipFill>
+                    <a:blip r:embed="rId16"/>
+                    <a:stretch>
+                      <a:fillRect/>
+                    </a:stretch>
+                  </pic:blipFill>
+                  <pic:spPr>
+                    <a:xfrm>
+                      <a:off x="0" y="0"/>
+                      <a:ext cx="5943600" cy="2179320"/>
+                    </a:xfrm>
+                    <a:prstGeom prst="rect"/>
+                  </pic:spPr>
+                </pic:pic>
+              </a:graphicData>
+            </a:graphic>
+          </wp:inline>
+        </w:drawing>
+      </w:r>
+    </w:p>
+    <w:p>
+      <w:pPr>
+        <w:spacing w:before="80" w:after="280"/>
+        <w:jc w:val="left"/>
+      </w:pPr>
+      <w:r>
+        <w:rPr>
+          <w:rFonts w:ascii="Times New Roman" w:hAnsi="Times New Roman"/>
+          <w:b/>
+          <w:i w:val="0"/>
+          <w:sz w:val="20"/>
+        </w:rPr>
+        <w:t xml:space="preserve">Figure 4. </w:t>
+      </w:r>
+      <w:r>
+        <w:rPr>
+          <w:rFonts w:ascii="Times New Roman" w:hAnsi="Times New Roman"/>
+          <w:b w:val="0"/>
+          <w:i/>
+          <w:sz w:val="20"/>
+        </w:rPr>
+        <w:t>Forest plot: RCT continuous outcomes (mean difference). Green = Vafaei 2019 (low RoB); blue = Srilekha 2021 (high RoB). *** p &lt; 0·001.</w:t>
+      </w:r>
+    </w:p>
+    <w:p>
+      <w:pPr>
         <w:pStyle w:val="Heading2"/>
       </w:pPr>
       <w:r>
@@ -837,6 +1341,69 @@
     </w:p>
     <w:p>
       <w:pPr>
+        <w:jc w:val="center"/>
+      </w:pPr>
+      <w:r>
+        <w:drawing>
+          <wp:inline xmlns:a="http://schemas.openxmlformats.org/drawingml/2006/main" xmlns:pic="http://schemas.openxmlformats.org/drawingml/2006/picture">
+            <wp:extent cx="4114800" cy="3657600"/>
+            <wp:docPr id="9" name="Picture 9"/>
+            <wp:cNvGraphicFramePr>
+              <a:graphicFrameLocks noChangeAspect="1"/>
+            </wp:cNvGraphicFramePr>
+            <a:graphic>
+              <a:graphicData uri="http://schemas.openxmlformats.org/drawingml/2006/picture">
+                <pic:pic>
+                  <pic:nvPicPr>
+                    <pic:cNvPr id="0" name="Funnel_TrimFill.png"/>
+                    <pic:cNvPicPr/>
+                  </pic:nvPicPr>
+                  <pic:blipFill>
+                    <a:blip r:embed="rId17"/>
+                    <a:stretch>
+                      <a:fillRect/>
+                    </a:stretch>
+                  </pic:blipFill>
+                  <pic:spPr>
+                    <a:xfrm>
+                      <a:off x="0" y="0"/>
+                      <a:ext cx="4114800" cy="3657600"/>
+                    </a:xfrm>
+                    <a:prstGeom prst="rect"/>
+                  </pic:spPr>
+                </pic:pic>
+              </a:graphicData>
+            </a:graphic>
+          </wp:inline>
+        </w:drawing>
+      </w:r>
+    </w:p>
+    <w:p>
+      <w:pPr>
+        <w:spacing w:before="80" w:after="280"/>
+        <w:jc w:val="left"/>
+      </w:pPr>
+      <w:r>
+        <w:rPr>
+          <w:rFonts w:ascii="Times New Roman" w:hAnsi="Times New Roman"/>
+          <w:b/>
+          <w:i w:val="0"/>
+          <w:sz w:val="20"/>
+        </w:rPr>
+        <w:t xml:space="preserve">Figure S4. </w:t>
+      </w:r>
+      <w:r>
+        <w:rPr>
+          <w:rFonts w:ascii="Times New Roman" w:hAnsi="Times New Roman"/>
+          <w:b w:val="0"/>
+          <w:i/>
+          <w:sz w:val="20"/>
+        </w:rPr>
+        <w:t>Funnel plot with Duval &amp; Tweedie trim-and-fill analysis for SGA/FGR. Navy squares = observed studies. Orange dotted = adjusted estimate.</w:t>
+      </w:r>
+    </w:p>
+    <w:p>
+      <w:pPr>
         <w:pStyle w:val="Heading2"/>
       </w:pPr>
       <w:r>
@@ -893,6 +1460,258 @@
           <w:sz w:val="24"/>
         </w:rPr>
         <w:t>The certainty of evidence varied by outcome (figure S5): high for biometry/EFW (consistent, precise, large sample), moderate for SGA/FGR (downgraded for indirectness due to varied deficiency thresholds), moderate for femur and humerus length from RCTs (single study), low for EFW/BPD from the high risk-of-bias RCT, and low for fetal adiposity (imprecision and limited data).</w:t>
+      </w:r>
+    </w:p>
+    <w:p>
+      <w:pPr>
+        <w:jc w:val="center"/>
+      </w:pPr>
+      <w:r>
+        <w:drawing>
+          <wp:inline xmlns:a="http://schemas.openxmlformats.org/drawingml/2006/main" xmlns:pic="http://schemas.openxmlformats.org/drawingml/2006/picture">
+            <wp:extent cx="4572000" cy="3200400"/>
+            <wp:docPr id="10" name="Picture 10"/>
+            <wp:cNvGraphicFramePr>
+              <a:graphicFrameLocks noChangeAspect="1"/>
+            </wp:cNvGraphicFramePr>
+            <a:graphic>
+              <a:graphicData uri="http://schemas.openxmlformats.org/drawingml/2006/picture">
+                <pic:pic>
+                  <pic:nvPicPr>
+                    <pic:cNvPr id="0" name="GRADE_Profile.png"/>
+                    <pic:cNvPicPr/>
+                  </pic:nvPicPr>
+                  <pic:blipFill>
+                    <a:blip r:embed="rId18"/>
+                    <a:stretch>
+                      <a:fillRect/>
+                    </a:stretch>
+                  </pic:blipFill>
+                  <pic:spPr>
+                    <a:xfrm>
+                      <a:off x="0" y="0"/>
+                      <a:ext cx="4572000" cy="3200400"/>
+                    </a:xfrm>
+                    <a:prstGeom prst="rect"/>
+                  </pic:spPr>
+                </pic:pic>
+              </a:graphicData>
+            </a:graphic>
+          </wp:inline>
+        </w:drawing>
+      </w:r>
+    </w:p>
+    <w:p>
+      <w:pPr>
+        <w:spacing w:before="80" w:after="280"/>
+        <w:jc w:val="left"/>
+      </w:pPr>
+      <w:r>
+        <w:rPr>
+          <w:rFonts w:ascii="Times New Roman" w:hAnsi="Times New Roman"/>
+          <w:b/>
+          <w:i w:val="0"/>
+          <w:sz w:val="20"/>
+        </w:rPr>
+        <w:t xml:space="preserve">Figure S5. </w:t>
+      </w:r>
+      <w:r>
+        <w:rPr>
+          <w:rFonts w:ascii="Times New Roman" w:hAnsi="Times New Roman"/>
+          <w:b w:val="0"/>
+          <w:i/>
+          <w:sz w:val="20"/>
+        </w:rPr>
+        <w:t>GRADE evidence profile: certainty of evidence by outcome. High (green), Moderate (navy), Low (orange).</w:t>
+      </w:r>
+    </w:p>
+    <w:p>
+      <w:pPr>
+        <w:jc w:val="center"/>
+      </w:pPr>
+      <w:r>
+        <w:drawing>
+          <wp:inline xmlns:a="http://schemas.openxmlformats.org/drawingml/2006/main" xmlns:pic="http://schemas.openxmlformats.org/drawingml/2006/picture">
+            <wp:extent cx="4572000" cy="5029200"/>
+            <wp:docPr id="11" name="Picture 11"/>
+            <wp:cNvGraphicFramePr>
+              <a:graphicFrameLocks noChangeAspect="1"/>
+            </wp:cNvGraphicFramePr>
+            <a:graphic>
+              <a:graphicData uri="http://schemas.openxmlformats.org/drawingml/2006/picture">
+                <pic:pic>
+                  <pic:nvPicPr>
+                    <pic:cNvPr id="0" name="Narrative_Synthesis.png"/>
+                    <pic:cNvPicPr/>
+                  </pic:nvPicPr>
+                  <pic:blipFill>
+                    <a:blip r:embed="rId19"/>
+                    <a:stretch>
+                      <a:fillRect/>
+                    </a:stretch>
+                  </pic:blipFill>
+                  <pic:spPr>
+                    <a:xfrm>
+                      <a:off x="0" y="0"/>
+                      <a:ext cx="4572000" cy="5029200"/>
+                    </a:xfrm>
+                    <a:prstGeom prst="rect"/>
+                  </pic:spPr>
+                </pic:pic>
+              </a:graphicData>
+            </a:graphic>
+          </wp:inline>
+        </w:drawing>
+      </w:r>
+    </w:p>
+    <w:p>
+      <w:pPr>
+        <w:spacing w:before="80" w:after="280"/>
+        <w:jc w:val="left"/>
+      </w:pPr>
+      <w:r>
+        <w:rPr>
+          <w:rFonts w:ascii="Times New Roman" w:hAnsi="Times New Roman"/>
+          <w:b/>
+          <w:i w:val="0"/>
+          <w:sz w:val="20"/>
+        </w:rPr>
+        <w:t xml:space="preserve">Figure S7. </w:t>
+      </w:r>
+      <w:r>
+        <w:rPr>
+          <w:rFonts w:ascii="Times New Roman" w:hAnsi="Times New Roman"/>
+          <w:b w:val="0"/>
+          <w:i/>
+          <w:sz w:val="20"/>
+        </w:rPr>
+        <w:t>Narrative synthesis heatmap: direction of association and quality assessment (NOS/RoB) for all 26 studies.</w:t>
+      </w:r>
+    </w:p>
+    <w:p>
+      <w:pPr>
+        <w:jc w:val="center"/>
+      </w:pPr>
+      <w:r>
+        <w:drawing>
+          <wp:inline xmlns:a="http://schemas.openxmlformats.org/drawingml/2006/main" xmlns:pic="http://schemas.openxmlformats.org/drawingml/2006/picture">
+            <wp:extent cx="5943600" cy="3200400"/>
+            <wp:docPr id="12" name="Picture 12"/>
+            <wp:cNvGraphicFramePr>
+              <a:graphicFrameLocks noChangeAspect="1"/>
+            </wp:cNvGraphicFramePr>
+            <a:graphic>
+              <a:graphicData uri="http://schemas.openxmlformats.org/drawingml/2006/picture">
+                <pic:pic>
+                  <pic:nvPicPr>
+                    <pic:cNvPr id="0" name="BubblePlot.png"/>
+                    <pic:cNvPicPr/>
+                  </pic:nvPicPr>
+                  <pic:blipFill>
+                    <a:blip r:embed="rId20"/>
+                    <a:stretch>
+                      <a:fillRect/>
+                    </a:stretch>
+                  </pic:blipFill>
+                  <pic:spPr>
+                    <a:xfrm>
+                      <a:off x="0" y="0"/>
+                      <a:ext cx="5943600" cy="3200400"/>
+                    </a:xfrm>
+                    <a:prstGeom prst="rect"/>
+                  </pic:spPr>
+                </pic:pic>
+              </a:graphicData>
+            </a:graphic>
+          </wp:inline>
+        </w:drawing>
+      </w:r>
+    </w:p>
+    <w:p>
+      <w:pPr>
+        <w:spacing w:before="80" w:after="280"/>
+        <w:jc w:val="left"/>
+      </w:pPr>
+      <w:r>
+        <w:rPr>
+          <w:rFonts w:ascii="Times New Roman" w:hAnsi="Times New Roman"/>
+          <w:b/>
+          <w:i w:val="0"/>
+          <w:sz w:val="20"/>
+        </w:rPr>
+        <w:t xml:space="preserve">Figure S6. </w:t>
+      </w:r>
+      <w:r>
+        <w:rPr>
+          <w:rFonts w:ascii="Times New Roman" w:hAnsi="Times New Roman"/>
+          <w:b w:val="0"/>
+          <w:i/>
+          <w:sz w:val="20"/>
+        </w:rPr>
+        <w:t>Bubble plot: mean maternal 25(OH)D (nmol/L) vs sample size. Dashed red line = 50 nmol/L sufficiency threshold.</w:t>
+      </w:r>
+    </w:p>
+    <w:p>
+      <w:pPr>
+        <w:jc w:val="center"/>
+      </w:pPr>
+      <w:r>
+        <w:drawing>
+          <wp:inline xmlns:a="http://schemas.openxmlformats.org/drawingml/2006/main" xmlns:pic="http://schemas.openxmlformats.org/drawingml/2006/picture">
+            <wp:extent cx="5943600" cy="2971800"/>
+            <wp:docPr id="13" name="Picture 13"/>
+            <wp:cNvGraphicFramePr>
+              <a:graphicFrameLocks noChangeAspect="1"/>
+            </wp:cNvGraphicFramePr>
+            <a:graphic>
+              <a:graphicData uri="http://schemas.openxmlformats.org/drawingml/2006/picture">
+                <pic:pic>
+                  <pic:nvPicPr>
+                    <pic:cNvPr id="0" name="Outcome_CutoffSummary.png"/>
+                    <pic:cNvPicPr/>
+                  </pic:nvPicPr>
+                  <pic:blipFill>
+                    <a:blip r:embed="rId21"/>
+                    <a:stretch>
+                      <a:fillRect/>
+                    </a:stretch>
+                  </pic:blipFill>
+                  <pic:spPr>
+                    <a:xfrm>
+                      <a:off x="0" y="0"/>
+                      <a:ext cx="5943600" cy="2971800"/>
+                    </a:xfrm>
+                    <a:prstGeom prst="rect"/>
+                  </pic:spPr>
+                </pic:pic>
+              </a:graphicData>
+            </a:graphic>
+          </wp:inline>
+        </w:drawing>
+      </w:r>
+    </w:p>
+    <w:p>
+      <w:pPr>
+        <w:spacing w:before="80" w:after="280"/>
+        <w:jc w:val="left"/>
+      </w:pPr>
+      <w:r>
+        <w:rPr>
+          <w:rFonts w:ascii="Times New Roman" w:hAnsi="Times New Roman"/>
+          <w:b/>
+          <w:i w:val="0"/>
+          <w:sz w:val="20"/>
+        </w:rPr>
+        <w:t xml:space="preserve">Figure S10. </w:t>
+      </w:r>
+      <w:r>
+        <w:rPr>
+          <w:rFonts w:ascii="Times New Roman" w:hAnsi="Times New Roman"/>
+          <w:b w:val="0"/>
+          <w:i/>
+          <w:sz w:val="20"/>
+        </w:rPr>
+        <w:t>(a) Outcome categories by significance. (b) Vitamin D deficiency threshold distribution across studies.</w:t>
       </w:r>
     </w:p>
     <w:p>

</xml_diff>

<commit_message>
Final adjustments: PRISMA flow diagram, LOO 3-panel style, larger figures
- Added PRISMA flow diagram (extracted from draft) as Figure 1
- Redesigned LOO sensitivity as 3-panel layout matching other forest plots
- Increased all figure widths in manuscript (6.0-6.5 inches)
- Increased caption font to 11pt for readability
- Renumbered figures (PRISMA=1, Characteristics=2, SGA=3, Biometry=4, RCT=5)

Co-Authored-By: Claude Opus 4.6 (1M context) <noreply@anthropic.com>
</commit_message>
<xml_diff>
--- a/Manuscript_VitaminD_SR_Lancet.docx
+++ b/Manuscript_VitaminD_SR_Lancet.docx
@@ -564,6 +564,69 @@
     </w:p>
     <w:p>
       <w:pPr>
+        <w:jc w:val="center"/>
+      </w:pPr>
+      <w:r>
+        <w:drawing>
+          <wp:inline xmlns:a="http://schemas.openxmlformats.org/drawingml/2006/main" xmlns:pic="http://schemas.openxmlformats.org/drawingml/2006/picture">
+            <wp:extent cx="5029200" cy="5445502"/>
+            <wp:docPr id="1" name="Picture 1"/>
+            <wp:cNvGraphicFramePr>
+              <a:graphicFrameLocks noChangeAspect="1"/>
+            </wp:cNvGraphicFramePr>
+            <a:graphic>
+              <a:graphicData uri="http://schemas.openxmlformats.org/drawingml/2006/picture">
+                <pic:pic>
+                  <pic:nvPicPr>
+                    <pic:cNvPr id="0" name="PRISMA_FlowDiagram.png"/>
+                    <pic:cNvPicPr/>
+                  </pic:nvPicPr>
+                  <pic:blipFill>
+                    <a:blip r:embed="rId9"/>
+                    <a:stretch>
+                      <a:fillRect/>
+                    </a:stretch>
+                  </pic:blipFill>
+                  <pic:spPr>
+                    <a:xfrm>
+                      <a:off x="0" y="0"/>
+                      <a:ext cx="5029200" cy="5445502"/>
+                    </a:xfrm>
+                    <a:prstGeom prst="rect"/>
+                  </pic:spPr>
+                </pic:pic>
+              </a:graphicData>
+            </a:graphic>
+          </wp:inline>
+        </w:drawing>
+      </w:r>
+    </w:p>
+    <w:p>
+      <w:pPr>
+        <w:spacing w:before="80" w:after="280"/>
+        <w:jc w:val="left"/>
+      </w:pPr>
+      <w:r>
+        <w:rPr>
+          <w:rFonts w:ascii="Times New Roman" w:hAnsi="Times New Roman"/>
+          <w:b/>
+          <w:i w:val="0"/>
+          <w:sz w:val="22"/>
+        </w:rPr>
+        <w:t xml:space="preserve">Figure 1. </w:t>
+      </w:r>
+      <w:r>
+        <w:rPr>
+          <w:rFonts w:ascii="Times New Roman" w:hAnsi="Times New Roman"/>
+          <w:b w:val="0"/>
+          <w:i/>
+          <w:sz w:val="22"/>
+        </w:rPr>
+        <w:t>PRISMA 2020 flow diagram of study identification, screening, and inclusion.</w:t>
+      </w:r>
+    </w:p>
+    <w:p>
+      <w:pPr>
         <w:pStyle w:val="Heading2"/>
       </w:pPr>
       <w:r>
@@ -621,7 +684,7 @@
         <w:drawing>
           <wp:inline xmlns:a="http://schemas.openxmlformats.org/drawingml/2006/main" xmlns:pic="http://schemas.openxmlformats.org/drawingml/2006/picture">
             <wp:extent cx="5943600" cy="4358640"/>
-            <wp:docPr id="1" name="Picture 1"/>
+            <wp:docPr id="2" name="Picture 2"/>
             <wp:cNvGraphicFramePr>
               <a:graphicFrameLocks noChangeAspect="1"/>
             </wp:cNvGraphicFramePr>
@@ -633,7 +696,7 @@
                     <pic:cNvPicPr/>
                   </pic:nvPicPr>
                   <pic:blipFill>
-                    <a:blip r:embed="rId9"/>
+                    <a:blip r:embed="rId10"/>
                     <a:stretch>
                       <a:fillRect/>
                     </a:stretch>
@@ -662,16 +725,16 @@
           <w:rFonts w:ascii="Times New Roman" w:hAnsi="Times New Roman"/>
           <w:b/>
           <w:i w:val="0"/>
-          <w:sz w:val="20"/>
+          <w:sz w:val="22"/>
         </w:rPr>
-        <w:t xml:space="preserve">Figure 1. </w:t>
+        <w:t xml:space="preserve">Figure 2. </w:t>
       </w:r>
       <w:r>
         <w:rPr>
           <w:rFonts w:ascii="Times New Roman" w:hAnsi="Times New Roman"/>
           <w:b w:val="0"/>
           <w:i/>
-          <w:sz w:val="20"/>
+          <w:sz w:val="22"/>
         </w:rPr>
         <w:t>Characteristics of included studies (k = 26): (a) study design, (b) publication timeline, (c) geographic distribution, (d) methodological quality (NOS).</w:t>
       </w:r>
@@ -684,7 +747,7 @@
         <w:drawing>
           <wp:inline xmlns:a="http://schemas.openxmlformats.org/drawingml/2006/main" xmlns:pic="http://schemas.openxmlformats.org/drawingml/2006/picture">
             <wp:extent cx="5943600" cy="2759529"/>
-            <wp:docPr id="2" name="Picture 2"/>
+            <wp:docPr id="3" name="Picture 3"/>
             <wp:cNvGraphicFramePr>
               <a:graphicFrameLocks noChangeAspect="1"/>
             </wp:cNvGraphicFramePr>
@@ -696,7 +759,7 @@
                     <pic:cNvPicPr/>
                   </pic:nvPicPr>
                   <pic:blipFill>
-                    <a:blip r:embed="rId10"/>
+                    <a:blip r:embed="rId11"/>
                     <a:stretch>
                       <a:fillRect/>
                     </a:stretch>
@@ -725,7 +788,7 @@
           <w:rFonts w:ascii="Times New Roman" w:hAnsi="Times New Roman"/>
           <w:b/>
           <w:i w:val="0"/>
-          <w:sz w:val="20"/>
+          <w:sz w:val="22"/>
         </w:rPr>
         <w:t xml:space="preserve">Figure S9. </w:t>
       </w:r>
@@ -734,7 +797,7 @@
           <w:rFonts w:ascii="Times New Roman" w:hAnsi="Times New Roman"/>
           <w:b w:val="0"/>
           <w:i/>
-          <w:sz w:val="20"/>
+          <w:sz w:val="22"/>
         </w:rPr>
         <w:t>(a) Laboratory methods for 25(OH)D quantification across studies. (b) Maternal 25(OH)D concentrations by continent. Dashed red line = 50 nmol/L sufficiency threshold.</w:t>
       </w:r>
@@ -784,7 +847,7 @@
         <w:drawing>
           <wp:inline xmlns:a="http://schemas.openxmlformats.org/drawingml/2006/main" xmlns:pic="http://schemas.openxmlformats.org/drawingml/2006/picture">
             <wp:extent cx="5943600" cy="4086225"/>
-            <wp:docPr id="3" name="Picture 3"/>
+            <wp:docPr id="4" name="Picture 4"/>
             <wp:cNvGraphicFramePr>
               <a:graphicFrameLocks noChangeAspect="1"/>
             </wp:cNvGraphicFramePr>
@@ -796,7 +859,7 @@
                     <pic:cNvPicPr/>
                   </pic:nvPicPr>
                   <pic:blipFill>
-                    <a:blip r:embed="rId11"/>
+                    <a:blip r:embed="rId12"/>
                     <a:stretch>
                       <a:fillRect/>
                     </a:stretch>
@@ -825,7 +888,7 @@
           <w:rFonts w:ascii="Times New Roman" w:hAnsi="Times New Roman"/>
           <w:b/>
           <w:i w:val="0"/>
-          <w:sz w:val="20"/>
+          <w:sz w:val="22"/>
         </w:rPr>
         <w:t xml:space="preserve">Figure S1. </w:t>
       </w:r>
@@ -834,7 +897,7 @@
           <w:rFonts w:ascii="Times New Roman" w:hAnsi="Times New Roman"/>
           <w:b w:val="0"/>
           <w:i/>
-          <w:sz w:val="20"/>
+          <w:sz w:val="22"/>
         </w:rPr>
         <w:t>Methodological quality assessment. (a) JBI Critical Appraisal heatmap (Q1–Q9) for 24 observational studies. (b) Newcastle–Ottawa Scale scores. Dashed red line = NOS ≥ 7 (high quality threshold).</w:t>
       </w:r>
@@ -884,7 +947,7 @@
         <w:drawing>
           <wp:inline xmlns:a="http://schemas.openxmlformats.org/drawingml/2006/main" xmlns:pic="http://schemas.openxmlformats.org/drawingml/2006/picture">
             <wp:extent cx="5943600" cy="1857375"/>
-            <wp:docPr id="4" name="Picture 4"/>
+            <wp:docPr id="5" name="Picture 5"/>
             <wp:cNvGraphicFramePr>
               <a:graphicFrameLocks noChangeAspect="1"/>
             </wp:cNvGraphicFramePr>
@@ -896,7 +959,7 @@
                     <pic:cNvPicPr/>
                   </pic:nvPicPr>
                   <pic:blipFill>
-                    <a:blip r:embed="rId12"/>
+                    <a:blip r:embed="rId13"/>
                     <a:stretch>
                       <a:fillRect/>
                     </a:stretch>
@@ -925,16 +988,16 @@
           <w:rFonts w:ascii="Times New Roman" w:hAnsi="Times New Roman"/>
           <w:b/>
           <w:i w:val="0"/>
-          <w:sz w:val="20"/>
+          <w:sz w:val="22"/>
         </w:rPr>
-        <w:t xml:space="preserve">Figure 2. </w:t>
+        <w:t xml:space="preserve">Figure 3. </w:t>
       </w:r>
       <w:r>
         <w:rPr>
           <w:rFonts w:ascii="Times New Roman" w:hAnsi="Times New Roman"/>
           <w:b w:val="0"/>
           <w:i/>
-          <w:sz w:val="20"/>
+          <w:sz w:val="22"/>
         </w:rPr>
         <w:t>Forest plot: association between maternal vitamin D deficiency and SGA/FGR (k = 4; N = 9,033). Fixed-effects model; pooled OR = 1·95 (95% CI 1·47–2·59); I² = 0%. † Direction inverted to harmonise deficiency as increased risk.</w:t>
       </w:r>
@@ -997,8 +1060,8 @@
       <w:r>
         <w:drawing>
           <wp:inline xmlns:a="http://schemas.openxmlformats.org/drawingml/2006/main" xmlns:pic="http://schemas.openxmlformats.org/drawingml/2006/picture">
-            <wp:extent cx="5029200" cy="2095500"/>
-            <wp:docPr id="5" name="Picture 5"/>
+            <wp:extent cx="5943600" cy="2122714"/>
+            <wp:docPr id="6" name="Picture 6"/>
             <wp:cNvGraphicFramePr>
               <a:graphicFrameLocks noChangeAspect="1"/>
             </wp:cNvGraphicFramePr>
@@ -1010,7 +1073,7 @@
                     <pic:cNvPicPr/>
                   </pic:nvPicPr>
                   <pic:blipFill>
-                    <a:blip r:embed="rId13"/>
+                    <a:blip r:embed="rId14"/>
                     <a:stretch>
                       <a:fillRect/>
                     </a:stretch>
@@ -1018,7 +1081,7 @@
                   <pic:spPr>
                     <a:xfrm>
                       <a:off x="0" y="0"/>
-                      <a:ext cx="5029200" cy="2095500"/>
+                      <a:ext cx="5943600" cy="2122714"/>
                     </a:xfrm>
                     <a:prstGeom prst="rect"/>
                   </pic:spPr>
@@ -1039,7 +1102,7 @@
           <w:rFonts w:ascii="Times New Roman" w:hAnsi="Times New Roman"/>
           <w:b/>
           <w:i w:val="0"/>
-          <w:sz w:val="20"/>
+          <w:sz w:val="22"/>
         </w:rPr>
         <w:t xml:space="preserve">Figure S2. </w:t>
       </w:r>
@@ -1048,7 +1111,7 @@
           <w:rFonts w:ascii="Times New Roman" w:hAnsi="Times New Roman"/>
           <w:b w:val="0"/>
           <w:i/>
-          <w:sz w:val="20"/>
+          <w:sz w:val="22"/>
         </w:rPr>
         <w:t>Leave-one-out sensitivity analysis for SGA/FGR. All estimates remain statistically significant. Dashed line = overall pooled estimate.</w:t>
       </w:r>
@@ -1060,8 +1123,8 @@
       <w:r>
         <w:drawing>
           <wp:inline xmlns:a="http://schemas.openxmlformats.org/drawingml/2006/main" xmlns:pic="http://schemas.openxmlformats.org/drawingml/2006/picture">
-            <wp:extent cx="5029200" cy="2305050"/>
-            <wp:docPr id="6" name="Picture 6"/>
+            <wp:extent cx="5943600" cy="2724150"/>
+            <wp:docPr id="7" name="Picture 7"/>
             <wp:cNvGraphicFramePr>
               <a:graphicFrameLocks noChangeAspect="1"/>
             </wp:cNvGraphicFramePr>
@@ -1073,7 +1136,7 @@
                     <pic:cNvPicPr/>
                   </pic:nvPicPr>
                   <pic:blipFill>
-                    <a:blip r:embed="rId14"/>
+                    <a:blip r:embed="rId15"/>
                     <a:stretch>
                       <a:fillRect/>
                     </a:stretch>
@@ -1081,7 +1144,7 @@
                   <pic:spPr>
                     <a:xfrm>
                       <a:off x="0" y="0"/>
-                      <a:ext cx="5029200" cy="2305050"/>
+                      <a:ext cx="5943600" cy="2724150"/>
                     </a:xfrm>
                     <a:prstGeom prst="rect"/>
                   </pic:spPr>
@@ -1102,7 +1165,7 @@
           <w:rFonts w:ascii="Times New Roman" w:hAnsi="Times New Roman"/>
           <w:b/>
           <w:i w:val="0"/>
-          <w:sz w:val="20"/>
+          <w:sz w:val="22"/>
         </w:rPr>
         <w:t xml:space="preserve">Figure S3. </w:t>
       </w:r>
@@ -1111,7 +1174,7 @@
           <w:rFonts w:ascii="Times New Roman" w:hAnsi="Times New Roman"/>
           <w:b w:val="0"/>
           <w:i/>
-          <w:sz w:val="20"/>
+          <w:sz w:val="22"/>
         </w:rPr>
         <w:t>Subgroup forest plot by vitamin D deficiency threshold. All subgroups directionally consistent.</w:t>
       </w:r>
@@ -1161,7 +1224,7 @@
         <w:drawing>
           <wp:inline xmlns:a="http://schemas.openxmlformats.org/drawingml/2006/main" xmlns:pic="http://schemas.openxmlformats.org/drawingml/2006/picture">
             <wp:extent cx="5943600" cy="2179320"/>
-            <wp:docPr id="7" name="Picture 7"/>
+            <wp:docPr id="8" name="Picture 8"/>
             <wp:cNvGraphicFramePr>
               <a:graphicFrameLocks noChangeAspect="1"/>
             </wp:cNvGraphicFramePr>
@@ -1170,106 +1233,6 @@
                 <pic:pic>
                   <pic:nvPicPr>
                     <pic:cNvPr id="0" name="Forest_Biometry_EFW.png"/>
-                    <pic:cNvPicPr/>
-                  </pic:nvPicPr>
-                  <pic:blipFill>
-                    <a:blip r:embed="rId15"/>
-                    <a:stretch>
-                      <a:fillRect/>
-                    </a:stretch>
-                  </pic:blipFill>
-                  <pic:spPr>
-                    <a:xfrm>
-                      <a:off x="0" y="0"/>
-                      <a:ext cx="5943600" cy="2179320"/>
-                    </a:xfrm>
-                    <a:prstGeom prst="rect"/>
-                  </pic:spPr>
-                </pic:pic>
-              </a:graphicData>
-            </a:graphic>
-          </wp:inline>
-        </w:drawing>
-      </w:r>
-    </w:p>
-    <w:p>
-      <w:pPr>
-        <w:spacing w:before="80" w:after="280"/>
-        <w:jc w:val="left"/>
-      </w:pPr>
-      <w:r>
-        <w:rPr>
-          <w:rFonts w:ascii="Times New Roman" w:hAnsi="Times New Roman"/>
-          <w:b/>
-          <w:i w:val="0"/>
-          <w:sz w:val="20"/>
-        </w:rPr>
-        <w:t xml:space="preserve">Figure 3. </w:t>
-      </w:r>
-      <w:r>
-        <w:rPr>
-          <w:rFonts w:ascii="Times New Roman" w:hAnsi="Times New Roman"/>
-          <w:b w:val="0"/>
-          <w:i/>
-          <w:sz w:val="20"/>
-        </w:rPr>
-        <w:t>Forest plot: association between maternal vitamin D deficiency and fetal biometry/EFW (k = 4; N = 26,542). Fixed-effects model; pooled OR = 1·16 (95% CI 1·09–1·23); I² = 33%.</w:t>
-      </w:r>
-    </w:p>
-    <w:p>
-      <w:pPr>
-        <w:pStyle w:val="Heading2"/>
-      </w:pPr>
-      <w:r>
-        <w:rPr>
-          <w:rFonts w:ascii="Times New Roman" w:hAnsi="Times New Roman"/>
-          <w:color w:val="1A2E4A"/>
-        </w:rPr>
-        <w:t>RCT continuous outcomes</w:t>
-      </w:r>
-    </w:p>
-    <w:p>
-      <w:r>
-        <w:rPr>
-          <w:rFonts w:ascii="Times New Roman" w:hAnsi="Times New Roman"/>
-          <w:b w:val="0"/>
-          <w:i w:val="0"/>
-          <w:sz w:val="24"/>
-        </w:rPr>
-        <w:t>Two RCTs reported continuous fetal biometry outcomes with vitamin D supplementation (figure 4). Vafaei et al. (2019), a low risk-of-bias trial of 140 pregnant women receiving 1000 IU/day vitamin D, found significant increases in femur length (MD +1·98 mm [95% CI 1·28–2·68]; p &lt; 0·001) and humerus length (MD +1·39 mm [0·72–2·06]; p &lt; 0·001) at the second trimester.</w:t>
-      </w:r>
-    </w:p>
-    <w:p>
-      <w:pPr>
-        <w:ind w:firstLine="720"/>
-      </w:pPr>
-      <w:r>
-        <w:rPr>
-          <w:rFonts w:ascii="Times New Roman" w:hAnsi="Times New Roman"/>
-          <w:b w:val="0"/>
-          <w:i w:val="0"/>
-          <w:sz w:val="24"/>
-        </w:rPr>
-        <w:t>Srilekha et al. (2021), classified as high risk of bias, reported larger effects with supplementation: EFW +277 g (p &lt; 0·01), BPD +4·77 mm, and FL +3·03 mm. However, these findings should be interpreted with caution given the methodological limitations, including unclear allocation concealment and absence of outcome assessor blinding.</w:t>
-      </w:r>
-    </w:p>
-    <w:p>
-      <w:pPr>
-        <w:jc w:val="center"/>
-      </w:pPr>
-      <w:r>
-        <w:drawing>
-          <wp:inline xmlns:a="http://schemas.openxmlformats.org/drawingml/2006/main" xmlns:pic="http://schemas.openxmlformats.org/drawingml/2006/picture">
-            <wp:extent cx="5943600" cy="2179320"/>
-            <wp:docPr id="8" name="Picture 8"/>
-            <wp:cNvGraphicFramePr>
-              <a:graphicFrameLocks noChangeAspect="1"/>
-            </wp:cNvGraphicFramePr>
-            <a:graphic>
-              <a:graphicData uri="http://schemas.openxmlformats.org/drawingml/2006/picture">
-                <pic:pic>
-                  <pic:nvPicPr>
-                    <pic:cNvPr id="0" name="Forest_RCT_MD.png"/>
                     <pic:cNvPicPr/>
                   </pic:nvPicPr>
                   <pic:blipFill>
@@ -1302,7 +1265,7 @@
           <w:rFonts w:ascii="Times New Roman" w:hAnsi="Times New Roman"/>
           <w:b/>
           <w:i w:val="0"/>
-          <w:sz w:val="20"/>
+          <w:sz w:val="22"/>
         </w:rPr>
         <w:t xml:space="preserve">Figure 4. </w:t>
       </w:r>
@@ -1311,7 +1274,107 @@
           <w:rFonts w:ascii="Times New Roman" w:hAnsi="Times New Roman"/>
           <w:b w:val="0"/>
           <w:i/>
-          <w:sz w:val="20"/>
+          <w:sz w:val="22"/>
+        </w:rPr>
+        <w:t>Forest plot: association between maternal vitamin D deficiency and fetal biometry/EFW (k = 4; N = 26,542). Fixed-effects model; pooled OR = 1·16 (95% CI 1·09–1·23); I² = 33%.</w:t>
+      </w:r>
+    </w:p>
+    <w:p>
+      <w:pPr>
+        <w:pStyle w:val="Heading2"/>
+      </w:pPr>
+      <w:r>
+        <w:rPr>
+          <w:rFonts w:ascii="Times New Roman" w:hAnsi="Times New Roman"/>
+          <w:color w:val="1A2E4A"/>
+        </w:rPr>
+        <w:t>RCT continuous outcomes</w:t>
+      </w:r>
+    </w:p>
+    <w:p>
+      <w:r>
+        <w:rPr>
+          <w:rFonts w:ascii="Times New Roman" w:hAnsi="Times New Roman"/>
+          <w:b w:val="0"/>
+          <w:i w:val="0"/>
+          <w:sz w:val="24"/>
+        </w:rPr>
+        <w:t>Two RCTs reported continuous fetal biometry outcomes with vitamin D supplementation (figure 4). Vafaei et al. (2019), a low risk-of-bias trial of 140 pregnant women receiving 1000 IU/day vitamin D, found significant increases in femur length (MD +1·98 mm [95% CI 1·28–2·68]; p &lt; 0·001) and humerus length (MD +1·39 mm [0·72–2·06]; p &lt; 0·001) at the second trimester.</w:t>
+      </w:r>
+    </w:p>
+    <w:p>
+      <w:pPr>
+        <w:ind w:firstLine="720"/>
+      </w:pPr>
+      <w:r>
+        <w:rPr>
+          <w:rFonts w:ascii="Times New Roman" w:hAnsi="Times New Roman"/>
+          <w:b w:val="0"/>
+          <w:i w:val="0"/>
+          <w:sz w:val="24"/>
+        </w:rPr>
+        <w:t>Srilekha et al. (2021), classified as high risk of bias, reported larger effects with supplementation: EFW +277 g (p &lt; 0·01), BPD +4·77 mm, and FL +3·03 mm. However, these findings should be interpreted with caution given the methodological limitations, including unclear allocation concealment and absence of outcome assessor blinding.</w:t>
+      </w:r>
+    </w:p>
+    <w:p>
+      <w:pPr>
+        <w:jc w:val="center"/>
+      </w:pPr>
+      <w:r>
+        <w:drawing>
+          <wp:inline xmlns:a="http://schemas.openxmlformats.org/drawingml/2006/main" xmlns:pic="http://schemas.openxmlformats.org/drawingml/2006/picture">
+            <wp:extent cx="5943600" cy="2179320"/>
+            <wp:docPr id="9" name="Picture 9"/>
+            <wp:cNvGraphicFramePr>
+              <a:graphicFrameLocks noChangeAspect="1"/>
+            </wp:cNvGraphicFramePr>
+            <a:graphic>
+              <a:graphicData uri="http://schemas.openxmlformats.org/drawingml/2006/picture">
+                <pic:pic>
+                  <pic:nvPicPr>
+                    <pic:cNvPr id="0" name="Forest_RCT_MD.png"/>
+                    <pic:cNvPicPr/>
+                  </pic:nvPicPr>
+                  <pic:blipFill>
+                    <a:blip r:embed="rId17"/>
+                    <a:stretch>
+                      <a:fillRect/>
+                    </a:stretch>
+                  </pic:blipFill>
+                  <pic:spPr>
+                    <a:xfrm>
+                      <a:off x="0" y="0"/>
+                      <a:ext cx="5943600" cy="2179320"/>
+                    </a:xfrm>
+                    <a:prstGeom prst="rect"/>
+                  </pic:spPr>
+                </pic:pic>
+              </a:graphicData>
+            </a:graphic>
+          </wp:inline>
+        </w:drawing>
+      </w:r>
+    </w:p>
+    <w:p>
+      <w:pPr>
+        <w:spacing w:before="80" w:after="280"/>
+        <w:jc w:val="left"/>
+      </w:pPr>
+      <w:r>
+        <w:rPr>
+          <w:rFonts w:ascii="Times New Roman" w:hAnsi="Times New Roman"/>
+          <w:b/>
+          <w:i w:val="0"/>
+          <w:sz w:val="22"/>
+        </w:rPr>
+        <w:t xml:space="preserve">Figure 5. </w:t>
+      </w:r>
+      <w:r>
+        <w:rPr>
+          <w:rFonts w:ascii="Times New Roman" w:hAnsi="Times New Roman"/>
+          <w:b w:val="0"/>
+          <w:i/>
+          <w:sz w:val="22"/>
         </w:rPr>
         <w:t>Forest plot: RCT continuous outcomes (mean difference). Green = Vafaei 2019 (low RoB); blue = Srilekha 2021 (high RoB). *** p &lt; 0·001.</w:t>
       </w:r>
@@ -1346,8 +1409,8 @@
       <w:r>
         <w:drawing>
           <wp:inline xmlns:a="http://schemas.openxmlformats.org/drawingml/2006/main" xmlns:pic="http://schemas.openxmlformats.org/drawingml/2006/picture">
-            <wp:extent cx="4114800" cy="3657600"/>
-            <wp:docPr id="9" name="Picture 9"/>
+            <wp:extent cx="5029200" cy="4470400"/>
+            <wp:docPr id="10" name="Picture 10"/>
             <wp:cNvGraphicFramePr>
               <a:graphicFrameLocks noChangeAspect="1"/>
             </wp:cNvGraphicFramePr>
@@ -1359,7 +1422,7 @@
                     <pic:cNvPicPr/>
                   </pic:nvPicPr>
                   <pic:blipFill>
-                    <a:blip r:embed="rId17"/>
+                    <a:blip r:embed="rId18"/>
                     <a:stretch>
                       <a:fillRect/>
                     </a:stretch>
@@ -1367,7 +1430,7 @@
                   <pic:spPr>
                     <a:xfrm>
                       <a:off x="0" y="0"/>
-                      <a:ext cx="4114800" cy="3657600"/>
+                      <a:ext cx="5029200" cy="4470400"/>
                     </a:xfrm>
                     <a:prstGeom prst="rect"/>
                   </pic:spPr>
@@ -1388,7 +1451,7 @@
           <w:rFonts w:ascii="Times New Roman" w:hAnsi="Times New Roman"/>
           <w:b/>
           <w:i w:val="0"/>
-          <w:sz w:val="20"/>
+          <w:sz w:val="22"/>
         </w:rPr>
         <w:t xml:space="preserve">Figure S4. </w:t>
       </w:r>
@@ -1397,7 +1460,7 @@
           <w:rFonts w:ascii="Times New Roman" w:hAnsi="Times New Roman"/>
           <w:b w:val="0"/>
           <w:i/>
-          <w:sz w:val="20"/>
+          <w:sz w:val="22"/>
         </w:rPr>
         <w:t>Funnel plot with Duval &amp; Tweedie trim-and-fill analysis for SGA/FGR. Navy squares = observed studies. Orange dotted = adjusted estimate.</w:t>
       </w:r>
@@ -1469,8 +1532,8 @@
       <w:r>
         <w:drawing>
           <wp:inline xmlns:a="http://schemas.openxmlformats.org/drawingml/2006/main" xmlns:pic="http://schemas.openxmlformats.org/drawingml/2006/picture">
-            <wp:extent cx="4572000" cy="3200400"/>
-            <wp:docPr id="10" name="Picture 10"/>
+            <wp:extent cx="5486400" cy="3840480"/>
+            <wp:docPr id="11" name="Picture 11"/>
             <wp:cNvGraphicFramePr>
               <a:graphicFrameLocks noChangeAspect="1"/>
             </wp:cNvGraphicFramePr>
@@ -1482,7 +1545,7 @@
                     <pic:cNvPicPr/>
                   </pic:nvPicPr>
                   <pic:blipFill>
-                    <a:blip r:embed="rId18"/>
+                    <a:blip r:embed="rId19"/>
                     <a:stretch>
                       <a:fillRect/>
                     </a:stretch>
@@ -1490,7 +1553,7 @@
                   <pic:spPr>
                     <a:xfrm>
                       <a:off x="0" y="0"/>
-                      <a:ext cx="4572000" cy="3200400"/>
+                      <a:ext cx="5486400" cy="3840480"/>
                     </a:xfrm>
                     <a:prstGeom prst="rect"/>
                   </pic:spPr>
@@ -1511,7 +1574,7 @@
           <w:rFonts w:ascii="Times New Roman" w:hAnsi="Times New Roman"/>
           <w:b/>
           <w:i w:val="0"/>
-          <w:sz w:val="20"/>
+          <w:sz w:val="22"/>
         </w:rPr>
         <w:t xml:space="preserve">Figure S5. </w:t>
       </w:r>
@@ -1520,7 +1583,7 @@
           <w:rFonts w:ascii="Times New Roman" w:hAnsi="Times New Roman"/>
           <w:b w:val="0"/>
           <w:i/>
-          <w:sz w:val="20"/>
+          <w:sz w:val="22"/>
         </w:rPr>
         <w:t>GRADE evidence profile: certainty of evidence by outcome. High (green), Moderate (navy), Low (orange).</w:t>
       </w:r>
@@ -1532,8 +1595,8 @@
       <w:r>
         <w:drawing>
           <wp:inline xmlns:a="http://schemas.openxmlformats.org/drawingml/2006/main" xmlns:pic="http://schemas.openxmlformats.org/drawingml/2006/picture">
-            <wp:extent cx="4572000" cy="5029200"/>
-            <wp:docPr id="11" name="Picture 11"/>
+            <wp:extent cx="5486400" cy="6035040"/>
+            <wp:docPr id="12" name="Picture 12"/>
             <wp:cNvGraphicFramePr>
               <a:graphicFrameLocks noChangeAspect="1"/>
             </wp:cNvGraphicFramePr>
@@ -1545,7 +1608,7 @@
                     <pic:cNvPicPr/>
                   </pic:nvPicPr>
                   <pic:blipFill>
-                    <a:blip r:embed="rId19"/>
+                    <a:blip r:embed="rId20"/>
                     <a:stretch>
                       <a:fillRect/>
                     </a:stretch>
@@ -1553,7 +1616,7 @@
                   <pic:spPr>
                     <a:xfrm>
                       <a:off x="0" y="0"/>
-                      <a:ext cx="4572000" cy="5029200"/>
+                      <a:ext cx="5486400" cy="6035040"/>
                     </a:xfrm>
                     <a:prstGeom prst="rect"/>
                   </pic:spPr>
@@ -1574,7 +1637,7 @@
           <w:rFonts w:ascii="Times New Roman" w:hAnsi="Times New Roman"/>
           <w:b/>
           <w:i w:val="0"/>
-          <w:sz w:val="20"/>
+          <w:sz w:val="22"/>
         </w:rPr>
         <w:t xml:space="preserve">Figure S7. </w:t>
       </w:r>
@@ -1583,7 +1646,7 @@
           <w:rFonts w:ascii="Times New Roman" w:hAnsi="Times New Roman"/>
           <w:b w:val="0"/>
           <w:i/>
-          <w:sz w:val="20"/>
+          <w:sz w:val="22"/>
         </w:rPr>
         <w:t>Narrative synthesis heatmap: direction of association and quality assessment (NOS/RoB) for all 26 studies.</w:t>
       </w:r>
@@ -1596,7 +1659,7 @@
         <w:drawing>
           <wp:inline xmlns:a="http://schemas.openxmlformats.org/drawingml/2006/main" xmlns:pic="http://schemas.openxmlformats.org/drawingml/2006/picture">
             <wp:extent cx="5943600" cy="3200400"/>
-            <wp:docPr id="12" name="Picture 12"/>
+            <wp:docPr id="13" name="Picture 13"/>
             <wp:cNvGraphicFramePr>
               <a:graphicFrameLocks noChangeAspect="1"/>
             </wp:cNvGraphicFramePr>
@@ -1608,7 +1671,7 @@
                     <pic:cNvPicPr/>
                   </pic:nvPicPr>
                   <pic:blipFill>
-                    <a:blip r:embed="rId20"/>
+                    <a:blip r:embed="rId21"/>
                     <a:stretch>
                       <a:fillRect/>
                     </a:stretch>
@@ -1637,7 +1700,7 @@
           <w:rFonts w:ascii="Times New Roman" w:hAnsi="Times New Roman"/>
           <w:b/>
           <w:i w:val="0"/>
-          <w:sz w:val="20"/>
+          <w:sz w:val="22"/>
         </w:rPr>
         <w:t xml:space="preserve">Figure S6. </w:t>
       </w:r>
@@ -1646,7 +1709,7 @@
           <w:rFonts w:ascii="Times New Roman" w:hAnsi="Times New Roman"/>
           <w:b w:val="0"/>
           <w:i/>
-          <w:sz w:val="20"/>
+          <w:sz w:val="22"/>
         </w:rPr>
         <w:t>Bubble plot: mean maternal 25(OH)D (nmol/L) vs sample size. Dashed red line = 50 nmol/L sufficiency threshold.</w:t>
       </w:r>
@@ -1659,7 +1722,7 @@
         <w:drawing>
           <wp:inline xmlns:a="http://schemas.openxmlformats.org/drawingml/2006/main" xmlns:pic="http://schemas.openxmlformats.org/drawingml/2006/picture">
             <wp:extent cx="5943600" cy="2971800"/>
-            <wp:docPr id="13" name="Picture 13"/>
+            <wp:docPr id="14" name="Picture 14"/>
             <wp:cNvGraphicFramePr>
               <a:graphicFrameLocks noChangeAspect="1"/>
             </wp:cNvGraphicFramePr>
@@ -1671,7 +1734,7 @@
                     <pic:cNvPicPr/>
                   </pic:nvPicPr>
                   <pic:blipFill>
-                    <a:blip r:embed="rId21"/>
+                    <a:blip r:embed="rId22"/>
                     <a:stretch>
                       <a:fillRect/>
                     </a:stretch>
@@ -1700,7 +1763,7 @@
           <w:rFonts w:ascii="Times New Roman" w:hAnsi="Times New Roman"/>
           <w:b/>
           <w:i w:val="0"/>
-          <w:sz w:val="20"/>
+          <w:sz w:val="22"/>
         </w:rPr>
         <w:t xml:space="preserve">Figure S10. </w:t>
       </w:r>
@@ -1709,7 +1772,7 @@
           <w:rFonts w:ascii="Times New Roman" w:hAnsi="Times New Roman"/>
           <w:b w:val="0"/>
           <w:i/>
-          <w:sz w:val="20"/>
+          <w:sz w:val="22"/>
         </w:rPr>
         <w:t>(a) Outcome categories by significance. (b) Vitamin D deficiency threshold distribution across studies.</w:t>
       </w:r>

</xml_diff>

<commit_message>
Editorial review: reorganise figures, increase fonts, standardise formatting
Editorial improvements per scientific editor review:
- Main text: 5 figures only (PRISMA, Forest SGA, Forest Biometry, Forest RCT, GRADE)
- Supplementary: 9 figures (S1-S9) with all supporting analyses
- Quality_JBI_NOS: base_size 9→12, text 2.5→3.5pt, output 16x11→18x14 in
- Narrative_Synthesis: base_size 9→12, text 2.65→3.5pt, output 10x11→12x13 in
- Cutoff_Subgroup: OR format standardised to [lo–hi] brackets, text 2.9→3.3pt
- StudyCharacteristics: output 15x11→16x12 in
- Figure legends updated to match new numbering (5 main + 9 supplementary)
- All tables remain in manuscript (Table 1, 2, S1-S5)
- 7 tables + 14 figures = complete submission package

Co-Authored-By: Claude Opus 4.6 (1M context) <noreply@anthropic.com>
</commit_message>
<xml_diff>
--- a/Manuscript_VitaminD_SR_Lancet.docx
+++ b/Manuscript_VitaminD_SR_Lancet.docx
@@ -678,132 +678,6 @@
     </w:p>
     <w:p>
       <w:pPr>
-        <w:jc w:val="center"/>
-      </w:pPr>
-      <w:r>
-        <w:drawing>
-          <wp:inline xmlns:a="http://schemas.openxmlformats.org/drawingml/2006/main" xmlns:pic="http://schemas.openxmlformats.org/drawingml/2006/picture">
-            <wp:extent cx="5943600" cy="4358640"/>
-            <wp:docPr id="2" name="Picture 2"/>
-            <wp:cNvGraphicFramePr>
-              <a:graphicFrameLocks noChangeAspect="1"/>
-            </wp:cNvGraphicFramePr>
-            <a:graphic>
-              <a:graphicData uri="http://schemas.openxmlformats.org/drawingml/2006/picture">
-                <pic:pic>
-                  <pic:nvPicPr>
-                    <pic:cNvPr id="0" name="StudyCharacteristics.png"/>
-                    <pic:cNvPicPr/>
-                  </pic:nvPicPr>
-                  <pic:blipFill>
-                    <a:blip r:embed="rId10"/>
-                    <a:stretch>
-                      <a:fillRect/>
-                    </a:stretch>
-                  </pic:blipFill>
-                  <pic:spPr>
-                    <a:xfrm>
-                      <a:off x="0" y="0"/>
-                      <a:ext cx="5943600" cy="4358640"/>
-                    </a:xfrm>
-                    <a:prstGeom prst="rect"/>
-                  </pic:spPr>
-                </pic:pic>
-              </a:graphicData>
-            </a:graphic>
-          </wp:inline>
-        </w:drawing>
-      </w:r>
-    </w:p>
-    <w:p>
-      <w:pPr>
-        <w:spacing w:before="120" w:after="320"/>
-        <w:jc w:val="left"/>
-      </w:pPr>
-      <w:r>
-        <w:rPr>
-          <w:rFonts w:ascii="Times New Roman" w:hAnsi="Times New Roman"/>
-          <w:b/>
-          <w:i w:val="0"/>
-          <w:sz w:val="22"/>
-        </w:rPr>
-        <w:t xml:space="preserve">Figure 2. </w:t>
-      </w:r>
-      <w:r>
-        <w:rPr>
-          <w:rFonts w:ascii="Times New Roman" w:hAnsi="Times New Roman"/>
-          <w:b w:val="0"/>
-          <w:i/>
-          <w:sz w:val="22"/>
-        </w:rPr>
-        <w:t>Characteristics of included studies (k = 26): (a) study design, (b) publication timeline, (c) geographic distribution, (d) methodological quality (NOS).</w:t>
-      </w:r>
-    </w:p>
-    <w:p>
-      <w:pPr>
-        <w:jc w:val="center"/>
-      </w:pPr>
-      <w:r>
-        <w:drawing>
-          <wp:inline xmlns:a="http://schemas.openxmlformats.org/drawingml/2006/main" xmlns:pic="http://schemas.openxmlformats.org/drawingml/2006/picture">
-            <wp:extent cx="5943600" cy="2759529"/>
-            <wp:docPr id="3" name="Picture 3"/>
-            <wp:cNvGraphicFramePr>
-              <a:graphicFrameLocks noChangeAspect="1"/>
-            </wp:cNvGraphicFramePr>
-            <a:graphic>
-              <a:graphicData uri="http://schemas.openxmlformats.org/drawingml/2006/picture">
-                <pic:pic>
-                  <pic:nvPicPr>
-                    <pic:cNvPr id="0" name="LabMethods_VitD.png"/>
-                    <pic:cNvPicPr/>
-                  </pic:nvPicPr>
-                  <pic:blipFill>
-                    <a:blip r:embed="rId11"/>
-                    <a:stretch>
-                      <a:fillRect/>
-                    </a:stretch>
-                  </pic:blipFill>
-                  <pic:spPr>
-                    <a:xfrm>
-                      <a:off x="0" y="0"/>
-                      <a:ext cx="5943600" cy="2759529"/>
-                    </a:xfrm>
-                    <a:prstGeom prst="rect"/>
-                  </pic:spPr>
-                </pic:pic>
-              </a:graphicData>
-            </a:graphic>
-          </wp:inline>
-        </w:drawing>
-      </w:r>
-    </w:p>
-    <w:p>
-      <w:pPr>
-        <w:spacing w:before="120" w:after="320"/>
-        <w:jc w:val="left"/>
-      </w:pPr>
-      <w:r>
-        <w:rPr>
-          <w:rFonts w:ascii="Times New Roman" w:hAnsi="Times New Roman"/>
-          <w:b/>
-          <w:i w:val="0"/>
-          <w:sz w:val="22"/>
-        </w:rPr>
-        <w:t xml:space="preserve">Figure S9. </w:t>
-      </w:r>
-      <w:r>
-        <w:rPr>
-          <w:rFonts w:ascii="Times New Roman" w:hAnsi="Times New Roman"/>
-          <w:b w:val="0"/>
-          <w:i/>
-          <w:sz w:val="22"/>
-        </w:rPr>
-        <w:t>(a) Laboratory methods for 25(OH)D quantification across studies. (b) Maternal 25(OH)D concentrations by continent. Dashed red line = 50 nmol/L sufficiency threshold.</w:t>
-      </w:r>
-    </w:p>
-    <w:p>
-      <w:pPr>
         <w:spacing w:before="240" w:after="120"/>
       </w:pPr>
       <w:r>
@@ -5407,69 +5281,6 @@
           <w:sz w:val="24"/>
         </w:rPr>
         <w:t>For the two RCTs, assessment using the Cochrane RoB 2 tool indicated that Vafaei et al. (2019) had a low overall risk of bias, while Srilekha et al. (2021) had a high risk of bias, primarily due to concerns about the randomisation process, lack of outcome assessor blinding, and unclear allocation concealment.</w:t>
-      </w:r>
-    </w:p>
-    <w:p>
-      <w:pPr>
-        <w:jc w:val="center"/>
-      </w:pPr>
-      <w:r>
-        <w:drawing>
-          <wp:inline xmlns:a="http://schemas.openxmlformats.org/drawingml/2006/main" xmlns:pic="http://schemas.openxmlformats.org/drawingml/2006/picture">
-            <wp:extent cx="5943600" cy="4086225"/>
-            <wp:docPr id="4" name="Picture 4"/>
-            <wp:cNvGraphicFramePr>
-              <a:graphicFrameLocks noChangeAspect="1"/>
-            </wp:cNvGraphicFramePr>
-            <a:graphic>
-              <a:graphicData uri="http://schemas.openxmlformats.org/drawingml/2006/picture">
-                <pic:pic>
-                  <pic:nvPicPr>
-                    <pic:cNvPr id="0" name="Quality_JBI_NOS.png"/>
-                    <pic:cNvPicPr/>
-                  </pic:nvPicPr>
-                  <pic:blipFill>
-                    <a:blip r:embed="rId12"/>
-                    <a:stretch>
-                      <a:fillRect/>
-                    </a:stretch>
-                  </pic:blipFill>
-                  <pic:spPr>
-                    <a:xfrm>
-                      <a:off x="0" y="0"/>
-                      <a:ext cx="5943600" cy="4086225"/>
-                    </a:xfrm>
-                    <a:prstGeom prst="rect"/>
-                  </pic:spPr>
-                </pic:pic>
-              </a:graphicData>
-            </a:graphic>
-          </wp:inline>
-        </w:drawing>
-      </w:r>
-    </w:p>
-    <w:p>
-      <w:pPr>
-        <w:spacing w:before="120" w:after="320"/>
-        <w:jc w:val="left"/>
-      </w:pPr>
-      <w:r>
-        <w:rPr>
-          <w:rFonts w:ascii="Times New Roman" w:hAnsi="Times New Roman"/>
-          <w:b/>
-          <w:i w:val="0"/>
-          <w:sz w:val="22"/>
-        </w:rPr>
-        <w:t xml:space="preserve">Figure S1. </w:t>
-      </w:r>
-      <w:r>
-        <w:rPr>
-          <w:rFonts w:ascii="Times New Roman" w:hAnsi="Times New Roman"/>
-          <w:b w:val="0"/>
-          <w:i/>
-          <w:sz w:val="22"/>
-        </w:rPr>
-        <w:t>Methodological quality assessment. (a) JBI Critical Appraisal heatmap (Q1–Q9) for 24 observational studies. (b) Newcastle–Ottawa Scale scores. Dashed red line = NOS ≥ 7 (high quality threshold).</w:t>
       </w:r>
     </w:p>
     <w:p>
@@ -5517,7 +5328,7 @@
         <w:drawing>
           <wp:inline xmlns:a="http://schemas.openxmlformats.org/drawingml/2006/main" xmlns:pic="http://schemas.openxmlformats.org/drawingml/2006/picture">
             <wp:extent cx="5943600" cy="1857375"/>
-            <wp:docPr id="5" name="Picture 5"/>
+            <wp:docPr id="2" name="Picture 2"/>
             <wp:cNvGraphicFramePr>
               <a:graphicFrameLocks noChangeAspect="1"/>
             </wp:cNvGraphicFramePr>
@@ -5529,7 +5340,7 @@
                     <pic:cNvPicPr/>
                   </pic:nvPicPr>
                   <pic:blipFill>
-                    <a:blip r:embed="rId13"/>
+                    <a:blip r:embed="rId10"/>
                     <a:stretch>
                       <a:fillRect/>
                     </a:stretch>
@@ -5560,7 +5371,7 @@
           <w:i w:val="0"/>
           <w:sz w:val="22"/>
         </w:rPr>
-        <w:t xml:space="preserve">Figure 3. </w:t>
+        <w:t xml:space="preserve">Figure 2. </w:t>
       </w:r>
       <w:r>
         <w:rPr>
@@ -6735,132 +6546,6 @@
     </w:p>
     <w:p>
       <w:pPr>
-        <w:jc w:val="center"/>
-      </w:pPr>
-      <w:r>
-        <w:drawing>
-          <wp:inline xmlns:a="http://schemas.openxmlformats.org/drawingml/2006/main" xmlns:pic="http://schemas.openxmlformats.org/drawingml/2006/picture">
-            <wp:extent cx="5943600" cy="2122714"/>
-            <wp:docPr id="6" name="Picture 6"/>
-            <wp:cNvGraphicFramePr>
-              <a:graphicFrameLocks noChangeAspect="1"/>
-            </wp:cNvGraphicFramePr>
-            <a:graphic>
-              <a:graphicData uri="http://schemas.openxmlformats.org/drawingml/2006/picture">
-                <pic:pic>
-                  <pic:nvPicPr>
-                    <pic:cNvPr id="0" name="LOO_Sensitivity.png"/>
-                    <pic:cNvPicPr/>
-                  </pic:nvPicPr>
-                  <pic:blipFill>
-                    <a:blip r:embed="rId14"/>
-                    <a:stretch>
-                      <a:fillRect/>
-                    </a:stretch>
-                  </pic:blipFill>
-                  <pic:spPr>
-                    <a:xfrm>
-                      <a:off x="0" y="0"/>
-                      <a:ext cx="5943600" cy="2122714"/>
-                    </a:xfrm>
-                    <a:prstGeom prst="rect"/>
-                  </pic:spPr>
-                </pic:pic>
-              </a:graphicData>
-            </a:graphic>
-          </wp:inline>
-        </w:drawing>
-      </w:r>
-    </w:p>
-    <w:p>
-      <w:pPr>
-        <w:spacing w:before="120" w:after="320"/>
-        <w:jc w:val="left"/>
-      </w:pPr>
-      <w:r>
-        <w:rPr>
-          <w:rFonts w:ascii="Times New Roman" w:hAnsi="Times New Roman"/>
-          <w:b/>
-          <w:i w:val="0"/>
-          <w:sz w:val="22"/>
-        </w:rPr>
-        <w:t xml:space="preserve">Figure S2. </w:t>
-      </w:r>
-      <w:r>
-        <w:rPr>
-          <w:rFonts w:ascii="Times New Roman" w:hAnsi="Times New Roman"/>
-          <w:b w:val="0"/>
-          <w:i/>
-          <w:sz w:val="22"/>
-        </w:rPr>
-        <w:t>Leave-one-out sensitivity analysis for SGA/FGR. All estimates remain statistically significant. Dashed line = overall pooled estimate.</w:t>
-      </w:r>
-    </w:p>
-    <w:p>
-      <w:pPr>
-        <w:jc w:val="center"/>
-      </w:pPr>
-      <w:r>
-        <w:drawing>
-          <wp:inline xmlns:a="http://schemas.openxmlformats.org/drawingml/2006/main" xmlns:pic="http://schemas.openxmlformats.org/drawingml/2006/picture">
-            <wp:extent cx="5943600" cy="2724150"/>
-            <wp:docPr id="7" name="Picture 7"/>
-            <wp:cNvGraphicFramePr>
-              <a:graphicFrameLocks noChangeAspect="1"/>
-            </wp:cNvGraphicFramePr>
-            <a:graphic>
-              <a:graphicData uri="http://schemas.openxmlformats.org/drawingml/2006/picture">
-                <pic:pic>
-                  <pic:nvPicPr>
-                    <pic:cNvPr id="0" name="Cutoff_Subgroup.png"/>
-                    <pic:cNvPicPr/>
-                  </pic:nvPicPr>
-                  <pic:blipFill>
-                    <a:blip r:embed="rId15"/>
-                    <a:stretch>
-                      <a:fillRect/>
-                    </a:stretch>
-                  </pic:blipFill>
-                  <pic:spPr>
-                    <a:xfrm>
-                      <a:off x="0" y="0"/>
-                      <a:ext cx="5943600" cy="2724150"/>
-                    </a:xfrm>
-                    <a:prstGeom prst="rect"/>
-                  </pic:spPr>
-                </pic:pic>
-              </a:graphicData>
-            </a:graphic>
-          </wp:inline>
-        </w:drawing>
-      </w:r>
-    </w:p>
-    <w:p>
-      <w:pPr>
-        <w:spacing w:before="120" w:after="320"/>
-        <w:jc w:val="left"/>
-      </w:pPr>
-      <w:r>
-        <w:rPr>
-          <w:rFonts w:ascii="Times New Roman" w:hAnsi="Times New Roman"/>
-          <w:b/>
-          <w:i w:val="0"/>
-          <w:sz w:val="22"/>
-        </w:rPr>
-        <w:t xml:space="preserve">Figure S3. </w:t>
-      </w:r>
-      <w:r>
-        <w:rPr>
-          <w:rFonts w:ascii="Times New Roman" w:hAnsi="Times New Roman"/>
-          <w:b w:val="0"/>
-          <w:i/>
-          <w:sz w:val="22"/>
-        </w:rPr>
-        <w:t>Subgroup forest plot by vitamin D deficiency threshold. All subgroups directionally consistent.</w:t>
-      </w:r>
-    </w:p>
-    <w:p>
-      <w:pPr>
         <w:pStyle w:val="Heading2"/>
       </w:pPr>
       <w:r>
@@ -6904,7 +6589,7 @@
         <w:drawing>
           <wp:inline xmlns:a="http://schemas.openxmlformats.org/drawingml/2006/main" xmlns:pic="http://schemas.openxmlformats.org/drawingml/2006/picture">
             <wp:extent cx="5943600" cy="2179320"/>
-            <wp:docPr id="8" name="Picture 8"/>
+            <wp:docPr id="3" name="Picture 3"/>
             <wp:cNvGraphicFramePr>
               <a:graphicFrameLocks noChangeAspect="1"/>
             </wp:cNvGraphicFramePr>
@@ -6916,7 +6601,7 @@
                     <pic:cNvPicPr/>
                   </pic:nvPicPr>
                   <pic:blipFill>
-                    <a:blip r:embed="rId16"/>
+                    <a:blip r:embed="rId11"/>
                     <a:stretch>
                       <a:fillRect/>
                     </a:stretch>
@@ -6947,7 +6632,7 @@
           <w:i w:val="0"/>
           <w:sz w:val="22"/>
         </w:rPr>
-        <w:t xml:space="preserve">Figure 4. </w:t>
+        <w:t xml:space="preserve">Figure 3. </w:t>
       </w:r>
       <w:r>
         <w:rPr>
@@ -7004,7 +6689,7 @@
         <w:drawing>
           <wp:inline xmlns:a="http://schemas.openxmlformats.org/drawingml/2006/main" xmlns:pic="http://schemas.openxmlformats.org/drawingml/2006/picture">
             <wp:extent cx="5943600" cy="2179320"/>
-            <wp:docPr id="9" name="Picture 9"/>
+            <wp:docPr id="4" name="Picture 4"/>
             <wp:cNvGraphicFramePr>
               <a:graphicFrameLocks noChangeAspect="1"/>
             </wp:cNvGraphicFramePr>
@@ -7016,7 +6701,7 @@
                     <pic:cNvPicPr/>
                   </pic:nvPicPr>
                   <pic:blipFill>
-                    <a:blip r:embed="rId17"/>
+                    <a:blip r:embed="rId12"/>
                     <a:stretch>
                       <a:fillRect/>
                     </a:stretch>
@@ -7047,7 +6732,7 @@
           <w:i w:val="0"/>
           <w:sz w:val="22"/>
         </w:rPr>
-        <w:t xml:space="preserve">Figure 5. </w:t>
+        <w:t xml:space="preserve">Figure 4. </w:t>
       </w:r>
       <w:r>
         <w:rPr>
@@ -7080,69 +6765,6 @@
           <w:sz w:val="24"/>
         </w:rPr>
         <w:t>Egger’s linear regression test could not be reliably performed for the SGA/FGR meta-analysis due to the small number of studies (k = 4), which limits the statistical power of funnel plot asymmetry tests. Begg’s rank correlation test was non-significant. Duval &amp; Tweedie trim-and-fill analysis imputed no additional studies for SGA/FGR, indicating no evidence of funnel plot asymmetry (figure S4). For biometry/EFW, trim-and-fill analysis also imputed no studies, and the adjusted estimate remained unchanged.</w:t>
-      </w:r>
-    </w:p>
-    <w:p>
-      <w:pPr>
-        <w:jc w:val="center"/>
-      </w:pPr>
-      <w:r>
-        <w:drawing>
-          <wp:inline xmlns:a="http://schemas.openxmlformats.org/drawingml/2006/main" xmlns:pic="http://schemas.openxmlformats.org/drawingml/2006/picture">
-            <wp:extent cx="5029200" cy="4470400"/>
-            <wp:docPr id="10" name="Picture 10"/>
-            <wp:cNvGraphicFramePr>
-              <a:graphicFrameLocks noChangeAspect="1"/>
-            </wp:cNvGraphicFramePr>
-            <a:graphic>
-              <a:graphicData uri="http://schemas.openxmlformats.org/drawingml/2006/picture">
-                <pic:pic>
-                  <pic:nvPicPr>
-                    <pic:cNvPr id="0" name="Funnel_TrimFill.png"/>
-                    <pic:cNvPicPr/>
-                  </pic:nvPicPr>
-                  <pic:blipFill>
-                    <a:blip r:embed="rId18"/>
-                    <a:stretch>
-                      <a:fillRect/>
-                    </a:stretch>
-                  </pic:blipFill>
-                  <pic:spPr>
-                    <a:xfrm>
-                      <a:off x="0" y="0"/>
-                      <a:ext cx="5029200" cy="4470400"/>
-                    </a:xfrm>
-                    <a:prstGeom prst="rect"/>
-                  </pic:spPr>
-                </pic:pic>
-              </a:graphicData>
-            </a:graphic>
-          </wp:inline>
-        </w:drawing>
-      </w:r>
-    </w:p>
-    <w:p>
-      <w:pPr>
-        <w:spacing w:before="120" w:after="320"/>
-        <w:jc w:val="left"/>
-      </w:pPr>
-      <w:r>
-        <w:rPr>
-          <w:rFonts w:ascii="Times New Roman" w:hAnsi="Times New Roman"/>
-          <w:b/>
-          <w:i w:val="0"/>
-          <w:sz w:val="22"/>
-        </w:rPr>
-        <w:t xml:space="preserve">Figure S4. </w:t>
-      </w:r>
-      <w:r>
-        <w:rPr>
-          <w:rFonts w:ascii="Times New Roman" w:hAnsi="Times New Roman"/>
-          <w:b w:val="0"/>
-          <w:i/>
-          <w:sz w:val="22"/>
-        </w:rPr>
-        <w:t>Funnel plot with Duval &amp; Tweedie trim-and-fill analysis for SGA/FGR. Navy squares = observed studies. Orange dotted = adjusted estimate.</w:t>
       </w:r>
     </w:p>
     <w:p>
@@ -7213,7 +6835,7 @@
         <w:drawing>
           <wp:inline xmlns:a="http://schemas.openxmlformats.org/drawingml/2006/main" xmlns:pic="http://schemas.openxmlformats.org/drawingml/2006/picture">
             <wp:extent cx="5486400" cy="3840480"/>
-            <wp:docPr id="11" name="Picture 11"/>
+            <wp:docPr id="5" name="Picture 5"/>
             <wp:cNvGraphicFramePr>
               <a:graphicFrameLocks noChangeAspect="1"/>
             </wp:cNvGraphicFramePr>
@@ -7225,7 +6847,7 @@
                     <pic:cNvPicPr/>
                   </pic:nvPicPr>
                   <pic:blipFill>
-                    <a:blip r:embed="rId19"/>
+                    <a:blip r:embed="rId13"/>
                     <a:stretch>
                       <a:fillRect/>
                     </a:stretch>
@@ -7256,7 +6878,7 @@
           <w:i w:val="0"/>
           <w:sz w:val="22"/>
         </w:rPr>
-        <w:t xml:space="preserve">Figure S5. </w:t>
+        <w:t xml:space="preserve">Figure 5. </w:t>
       </w:r>
       <w:r>
         <w:rPr>
@@ -7266,195 +6888,6 @@
           <w:sz w:val="22"/>
         </w:rPr>
         <w:t>GRADE evidence profile: certainty of evidence by outcome. High (green), Moderate (navy), Low (orange).</w:t>
-      </w:r>
-    </w:p>
-    <w:p>
-      <w:pPr>
-        <w:jc w:val="center"/>
-      </w:pPr>
-      <w:r>
-        <w:drawing>
-          <wp:inline xmlns:a="http://schemas.openxmlformats.org/drawingml/2006/main" xmlns:pic="http://schemas.openxmlformats.org/drawingml/2006/picture">
-            <wp:extent cx="5486400" cy="6035040"/>
-            <wp:docPr id="12" name="Picture 12"/>
-            <wp:cNvGraphicFramePr>
-              <a:graphicFrameLocks noChangeAspect="1"/>
-            </wp:cNvGraphicFramePr>
-            <a:graphic>
-              <a:graphicData uri="http://schemas.openxmlformats.org/drawingml/2006/picture">
-                <pic:pic>
-                  <pic:nvPicPr>
-                    <pic:cNvPr id="0" name="Narrative_Synthesis.png"/>
-                    <pic:cNvPicPr/>
-                  </pic:nvPicPr>
-                  <pic:blipFill>
-                    <a:blip r:embed="rId20"/>
-                    <a:stretch>
-                      <a:fillRect/>
-                    </a:stretch>
-                  </pic:blipFill>
-                  <pic:spPr>
-                    <a:xfrm>
-                      <a:off x="0" y="0"/>
-                      <a:ext cx="5486400" cy="6035040"/>
-                    </a:xfrm>
-                    <a:prstGeom prst="rect"/>
-                  </pic:spPr>
-                </pic:pic>
-              </a:graphicData>
-            </a:graphic>
-          </wp:inline>
-        </w:drawing>
-      </w:r>
-    </w:p>
-    <w:p>
-      <w:pPr>
-        <w:spacing w:before="120" w:after="320"/>
-        <w:jc w:val="left"/>
-      </w:pPr>
-      <w:r>
-        <w:rPr>
-          <w:rFonts w:ascii="Times New Roman" w:hAnsi="Times New Roman"/>
-          <w:b/>
-          <w:i w:val="0"/>
-          <w:sz w:val="22"/>
-        </w:rPr>
-        <w:t xml:space="preserve">Figure S7. </w:t>
-      </w:r>
-      <w:r>
-        <w:rPr>
-          <w:rFonts w:ascii="Times New Roman" w:hAnsi="Times New Roman"/>
-          <w:b w:val="0"/>
-          <w:i/>
-          <w:sz w:val="22"/>
-        </w:rPr>
-        <w:t>Narrative synthesis heatmap: direction of association and quality assessment (NOS/RoB) for all 26 studies.</w:t>
-      </w:r>
-    </w:p>
-    <w:p>
-      <w:pPr>
-        <w:jc w:val="center"/>
-      </w:pPr>
-      <w:r>
-        <w:drawing>
-          <wp:inline xmlns:a="http://schemas.openxmlformats.org/drawingml/2006/main" xmlns:pic="http://schemas.openxmlformats.org/drawingml/2006/picture">
-            <wp:extent cx="5943600" cy="3200400"/>
-            <wp:docPr id="13" name="Picture 13"/>
-            <wp:cNvGraphicFramePr>
-              <a:graphicFrameLocks noChangeAspect="1"/>
-            </wp:cNvGraphicFramePr>
-            <a:graphic>
-              <a:graphicData uri="http://schemas.openxmlformats.org/drawingml/2006/picture">
-                <pic:pic>
-                  <pic:nvPicPr>
-                    <pic:cNvPr id="0" name="BubblePlot.png"/>
-                    <pic:cNvPicPr/>
-                  </pic:nvPicPr>
-                  <pic:blipFill>
-                    <a:blip r:embed="rId21"/>
-                    <a:stretch>
-                      <a:fillRect/>
-                    </a:stretch>
-                  </pic:blipFill>
-                  <pic:spPr>
-                    <a:xfrm>
-                      <a:off x="0" y="0"/>
-                      <a:ext cx="5943600" cy="3200400"/>
-                    </a:xfrm>
-                    <a:prstGeom prst="rect"/>
-                  </pic:spPr>
-                </pic:pic>
-              </a:graphicData>
-            </a:graphic>
-          </wp:inline>
-        </w:drawing>
-      </w:r>
-    </w:p>
-    <w:p>
-      <w:pPr>
-        <w:spacing w:before="120" w:after="320"/>
-        <w:jc w:val="left"/>
-      </w:pPr>
-      <w:r>
-        <w:rPr>
-          <w:rFonts w:ascii="Times New Roman" w:hAnsi="Times New Roman"/>
-          <w:b/>
-          <w:i w:val="0"/>
-          <w:sz w:val="22"/>
-        </w:rPr>
-        <w:t xml:space="preserve">Figure S6. </w:t>
-      </w:r>
-      <w:r>
-        <w:rPr>
-          <w:rFonts w:ascii="Times New Roman" w:hAnsi="Times New Roman"/>
-          <w:b w:val="0"/>
-          <w:i/>
-          <w:sz w:val="22"/>
-        </w:rPr>
-        <w:t>Bubble plot: mean maternal 25(OH)D (nmol/L) vs sample size. Dashed red line = 50 nmol/L sufficiency threshold.</w:t>
-      </w:r>
-    </w:p>
-    <w:p>
-      <w:pPr>
-        <w:jc w:val="center"/>
-      </w:pPr>
-      <w:r>
-        <w:drawing>
-          <wp:inline xmlns:a="http://schemas.openxmlformats.org/drawingml/2006/main" xmlns:pic="http://schemas.openxmlformats.org/drawingml/2006/picture">
-            <wp:extent cx="5943600" cy="2971800"/>
-            <wp:docPr id="14" name="Picture 14"/>
-            <wp:cNvGraphicFramePr>
-              <a:graphicFrameLocks noChangeAspect="1"/>
-            </wp:cNvGraphicFramePr>
-            <a:graphic>
-              <a:graphicData uri="http://schemas.openxmlformats.org/drawingml/2006/picture">
-                <pic:pic>
-                  <pic:nvPicPr>
-                    <pic:cNvPr id="0" name="Outcome_CutoffSummary.png"/>
-                    <pic:cNvPicPr/>
-                  </pic:nvPicPr>
-                  <pic:blipFill>
-                    <a:blip r:embed="rId22"/>
-                    <a:stretch>
-                      <a:fillRect/>
-                    </a:stretch>
-                  </pic:blipFill>
-                  <pic:spPr>
-                    <a:xfrm>
-                      <a:off x="0" y="0"/>
-                      <a:ext cx="5943600" cy="2971800"/>
-                    </a:xfrm>
-                    <a:prstGeom prst="rect"/>
-                  </pic:spPr>
-                </pic:pic>
-              </a:graphicData>
-            </a:graphic>
-          </wp:inline>
-        </w:drawing>
-      </w:r>
-    </w:p>
-    <w:p>
-      <w:pPr>
-        <w:spacing w:before="120" w:after="320"/>
-        <w:jc w:val="left"/>
-      </w:pPr>
-      <w:r>
-        <w:rPr>
-          <w:rFonts w:ascii="Times New Roman" w:hAnsi="Times New Roman"/>
-          <w:b/>
-          <w:i w:val="0"/>
-          <w:sz w:val="22"/>
-        </w:rPr>
-        <w:t xml:space="preserve">Figure S10. </w:t>
-      </w:r>
-      <w:r>
-        <w:rPr>
-          <w:rFonts w:ascii="Times New Roman" w:hAnsi="Times New Roman"/>
-          <w:b w:val="0"/>
-          <w:i/>
-          <w:sz w:val="22"/>
-        </w:rPr>
-        <w:t>(a) Outcome categories by significance. (b) Vitamin D deficiency threshold distribution across studies.</w:t>
       </w:r>
     </w:p>
     <w:p>
@@ -8183,7 +7616,7 @@
           <w:i w:val="0"/>
           <w:sz w:val="24"/>
         </w:rPr>
-        <w:t xml:space="preserve"> PRISMA 2020 flow diagram of study selection.</w:t>
+        <w:t xml:space="preserve"> PRISMA 2020 flow diagram of study identification, screening, and inclusion.</w:t>
       </w:r>
     </w:p>
     <w:p>
@@ -8203,7 +7636,7 @@
           <w:i w:val="0"/>
           <w:sz w:val="24"/>
         </w:rPr>
-        <w:t xml:space="preserve"> Forest plot of the association between maternal vitamin D deficiency and SGA/FGR risk (k = 4; N = 9033). Fixed-effects model; pooled OR = 1·95 (95% CI 1·47–2·59); I² = 0%. † Direction inverted from original study to harmonise deficiency as increased risk.</w:t>
+        <w:t xml:space="preserve"> Forest plot: maternal vitamin D deficiency and SGA/FGR risk (k = 4; N = 9,033). Fixed-effects; OR = 1·95 [95% CI 1·47–2·59]; I² = 0%.</w:t>
       </w:r>
     </w:p>
     <w:p>
@@ -8223,7 +7656,7 @@
           <w:i w:val="0"/>
           <w:sz w:val="24"/>
         </w:rPr>
-        <w:t xml:space="preserve"> Forest plot of the association between maternal vitamin D deficiency and fetal biometry/EFW outcomes (k = 4; N = 26,542). Fixed-effects model; pooled OR = 1·16 (95% CI 1·09–1·23); I² = 33%.</w:t>
+        <w:t xml:space="preserve"> Forest plot: maternal vitamin D deficiency and fetal biometry/EFW (k = 4; N = 26,542). Fixed-effects; OR = 1·16 [1·09–1·23]; I² = 33%.</w:t>
       </w:r>
     </w:p>
     <w:p>
@@ -8243,7 +7676,27 @@
           <w:i w:val="0"/>
           <w:sz w:val="24"/>
         </w:rPr>
-        <w:t xml:space="preserve"> Forest plot of RCT continuous outcomes: mean difference in fetal biometry with vitamin D supplementation vs control. Green: Vafaei et al. 2019 (low risk of bias); blue: Srilekha et al. 2021 (high risk of bias).</w:t>
+        <w:t xml:space="preserve"> Forest plot: RCT continuous outcomes (mean difference). Green = Vafaei 2019 (low RoB); blue = Srilekha 2021 (high RoB).</w:t>
+      </w:r>
+    </w:p>
+    <w:p>
+      <w:r>
+        <w:rPr>
+          <w:rFonts w:ascii="Times New Roman" w:hAnsi="Times New Roman"/>
+          <w:b/>
+          <w:i w:val="0"/>
+          <w:sz w:val="24"/>
+        </w:rPr>
+        <w:t>Figure 5.</w:t>
+      </w:r>
+      <w:r>
+        <w:rPr>
+          <w:rFonts w:ascii="Times New Roman" w:hAnsi="Times New Roman"/>
+          <w:b w:val="0"/>
+          <w:i w:val="0"/>
+          <w:sz w:val="24"/>
+        </w:rPr>
+        <w:t xml:space="preserve"> GRADE evidence profile: certainty of evidence by primary outcome.</w:t>
       </w:r>
     </w:p>
     <w:p/>
@@ -8276,7 +7729,7 @@
           <w:i w:val="0"/>
           <w:sz w:val="24"/>
         </w:rPr>
-        <w:t xml:space="preserve"> JBI Critical Appraisal heatmap (Q1–Q9) and Newcastle–Ottawa Scale bar chart for 24 observational studies.</w:t>
+        <w:t xml:space="preserve"> Study characteristics: (a) design, (b) timeline, (c) geographic distribution, (d) quality.</w:t>
       </w:r>
     </w:p>
     <w:p>
@@ -8296,7 +7749,7 @@
           <w:i w:val="0"/>
           <w:sz w:val="24"/>
         </w:rPr>
-        <w:t xml:space="preserve"> Leave-one-out sensitivity analysis for the SGA/FGR meta-analysis.</w:t>
+        <w:t xml:space="preserve"> Laboratory methods for 25(OH)D and maternal concentrations by continent.</w:t>
       </w:r>
     </w:p>
     <w:p>
@@ -8316,7 +7769,7 @@
           <w:i w:val="0"/>
           <w:sz w:val="24"/>
         </w:rPr>
-        <w:t xml:space="preserve"> Subgroup forest plot by vitamin D deficiency threshold.</w:t>
+        <w:t xml:space="preserve"> JBI Critical Appraisal heatmap and Newcastle–Ottawa Scale scores.</w:t>
       </w:r>
     </w:p>
     <w:p>
@@ -8336,7 +7789,7 @@
           <w:i w:val="0"/>
           <w:sz w:val="24"/>
         </w:rPr>
-        <w:t xml:space="preserve"> Funnel plot with Duval &amp; Tweedie trim-and-fill analysis.</w:t>
+        <w:t xml:space="preserve"> Leave-one-out sensitivity analysis for SGA/FGR.</w:t>
       </w:r>
     </w:p>
     <w:p>
@@ -8356,7 +7809,7 @@
           <w:i w:val="0"/>
           <w:sz w:val="24"/>
         </w:rPr>
-        <w:t xml:space="preserve"> GRADE evidence profile for all outcomes.</w:t>
+        <w:t xml:space="preserve"> Subgroup forest plot by vitamin D deficiency threshold.</w:t>
       </w:r>
     </w:p>
     <w:p>
@@ -8376,7 +7829,7 @@
           <w:i w:val="0"/>
           <w:sz w:val="24"/>
         </w:rPr>
-        <w:t xml:space="preserve"> Bubble plot of mean maternal 25(OH)D concentration vs sample size.</w:t>
+        <w:t xml:space="preserve"> Funnel plot with Duval &amp; Tweedie trim-and-fill analysis.</w:t>
       </w:r>
     </w:p>
     <w:p>
@@ -8396,7 +7849,7 @@
           <w:i w:val="0"/>
           <w:sz w:val="24"/>
         </w:rPr>
-        <w:t xml:space="preserve"> Narrative synthesis heatmap (direction of association and quality).</w:t>
+        <w:t xml:space="preserve"> Bubble plot: mean maternal 25(OH)D vs sample size.</w:t>
       </w:r>
     </w:p>
     <w:p>
@@ -8416,7 +7869,7 @@
           <w:i w:val="0"/>
           <w:sz w:val="24"/>
         </w:rPr>
-        <w:t xml:space="preserve"> Study characteristics: design distribution, timeline, geographic map, and quality summary.</w:t>
+        <w:t xml:space="preserve"> Narrative synthesis heatmap (association direction and quality).</w:t>
       </w:r>
     </w:p>
     <w:p>
@@ -8436,27 +7889,7 @@
           <w:i w:val="0"/>
           <w:sz w:val="24"/>
         </w:rPr>
-        <w:t xml:space="preserve"> Laboratory methods for 25(OH)D measurement and maternal vitamin D concentrations by continent.</w:t>
-      </w:r>
-    </w:p>
-    <w:p>
-      <w:r>
-        <w:rPr>
-          <w:rFonts w:ascii="Times New Roman" w:hAnsi="Times New Roman"/>
-          <w:b/>
-          <w:i w:val="0"/>
-          <w:sz w:val="24"/>
-        </w:rPr>
-        <w:t>Figure S10.</w:t>
-      </w:r>
-      <w:r>
-        <w:rPr>
-          <w:rFonts w:ascii="Times New Roman" w:hAnsi="Times New Roman"/>
-          <w:b w:val="0"/>
-          <w:i w:val="0"/>
-          <w:sz w:val="24"/>
-        </w:rPr>
-        <w:t xml:space="preserve"> Outcome category distribution and vitamin D deficiency threshold summary.</w:t>
+        <w:t xml:space="preserve"> Outcome categories and vitamin D deficiency threshold distribution.</w:t>
       </w:r>
     </w:p>
     <w:p>
@@ -15994,6 +15427,590 @@
       </w:tr>
     </w:tbl>
     <w:p/>
+    <w:p>
+      <w:r>
+        <w:br w:type="page"/>
+      </w:r>
+    </w:p>
+    <w:p>
+      <w:pPr>
+        <w:pStyle w:val="Heading2"/>
+      </w:pPr>
+      <w:r>
+        <w:rPr>
+          <w:rFonts w:ascii="Times New Roman" w:hAnsi="Times New Roman"/>
+          <w:color w:val="1A2E4A"/>
+        </w:rPr>
+        <w:t>Supplementary Figures</w:t>
+      </w:r>
+    </w:p>
+    <w:p>
+      <w:pPr>
+        <w:jc w:val="center"/>
+      </w:pPr>
+      <w:r>
+        <w:drawing>
+          <wp:inline xmlns:a="http://schemas.openxmlformats.org/drawingml/2006/main" xmlns:pic="http://schemas.openxmlformats.org/drawingml/2006/picture">
+            <wp:extent cx="5943600" cy="4457700"/>
+            <wp:docPr id="6" name="Picture 6"/>
+            <wp:cNvGraphicFramePr>
+              <a:graphicFrameLocks noChangeAspect="1"/>
+            </wp:cNvGraphicFramePr>
+            <a:graphic>
+              <a:graphicData uri="http://schemas.openxmlformats.org/drawingml/2006/picture">
+                <pic:pic>
+                  <pic:nvPicPr>
+                    <pic:cNvPr id="0" name="StudyCharacteristics.png"/>
+                    <pic:cNvPicPr/>
+                  </pic:nvPicPr>
+                  <pic:blipFill>
+                    <a:blip r:embed="rId14"/>
+                    <a:stretch>
+                      <a:fillRect/>
+                    </a:stretch>
+                  </pic:blipFill>
+                  <pic:spPr>
+                    <a:xfrm>
+                      <a:off x="0" y="0"/>
+                      <a:ext cx="5943600" cy="4457700"/>
+                    </a:xfrm>
+                    <a:prstGeom prst="rect"/>
+                  </pic:spPr>
+                </pic:pic>
+              </a:graphicData>
+            </a:graphic>
+          </wp:inline>
+        </w:drawing>
+      </w:r>
+    </w:p>
+    <w:p>
+      <w:pPr>
+        <w:spacing w:before="120" w:after="320"/>
+        <w:jc w:val="left"/>
+      </w:pPr>
+      <w:r>
+        <w:rPr>
+          <w:rFonts w:ascii="Times New Roman" w:hAnsi="Times New Roman"/>
+          <w:b/>
+          <w:i w:val="0"/>
+          <w:sz w:val="22"/>
+        </w:rPr>
+        <w:t xml:space="preserve">Figure S1. </w:t>
+      </w:r>
+      <w:r>
+        <w:rPr>
+          <w:rFonts w:ascii="Times New Roman" w:hAnsi="Times New Roman"/>
+          <w:b w:val="0"/>
+          <w:i/>
+          <w:sz w:val="22"/>
+        </w:rPr>
+        <w:t>Characteristics of included studies (k = 26): (a) study design, (b) publication timeline, (c) geographic distribution, (d) methodological quality (NOS).</w:t>
+      </w:r>
+    </w:p>
+    <w:p>
+      <w:pPr>
+        <w:jc w:val="center"/>
+      </w:pPr>
+      <w:r>
+        <w:drawing>
+          <wp:inline xmlns:a="http://schemas.openxmlformats.org/drawingml/2006/main" xmlns:pic="http://schemas.openxmlformats.org/drawingml/2006/picture">
+            <wp:extent cx="5943600" cy="2759529"/>
+            <wp:docPr id="7" name="Picture 7"/>
+            <wp:cNvGraphicFramePr>
+              <a:graphicFrameLocks noChangeAspect="1"/>
+            </wp:cNvGraphicFramePr>
+            <a:graphic>
+              <a:graphicData uri="http://schemas.openxmlformats.org/drawingml/2006/picture">
+                <pic:pic>
+                  <pic:nvPicPr>
+                    <pic:cNvPr id="0" name="LabMethods_VitD.png"/>
+                    <pic:cNvPicPr/>
+                  </pic:nvPicPr>
+                  <pic:blipFill>
+                    <a:blip r:embed="rId15"/>
+                    <a:stretch>
+                      <a:fillRect/>
+                    </a:stretch>
+                  </pic:blipFill>
+                  <pic:spPr>
+                    <a:xfrm>
+                      <a:off x="0" y="0"/>
+                      <a:ext cx="5943600" cy="2759529"/>
+                    </a:xfrm>
+                    <a:prstGeom prst="rect"/>
+                  </pic:spPr>
+                </pic:pic>
+              </a:graphicData>
+            </a:graphic>
+          </wp:inline>
+        </w:drawing>
+      </w:r>
+    </w:p>
+    <w:p>
+      <w:pPr>
+        <w:spacing w:before="120" w:after="320"/>
+        <w:jc w:val="left"/>
+      </w:pPr>
+      <w:r>
+        <w:rPr>
+          <w:rFonts w:ascii="Times New Roman" w:hAnsi="Times New Roman"/>
+          <w:b/>
+          <w:i w:val="0"/>
+          <w:sz w:val="22"/>
+        </w:rPr>
+        <w:t xml:space="preserve">Figure S2. </w:t>
+      </w:r>
+      <w:r>
+        <w:rPr>
+          <w:rFonts w:ascii="Times New Roman" w:hAnsi="Times New Roman"/>
+          <w:b w:val="0"/>
+          <w:i/>
+          <w:sz w:val="22"/>
+        </w:rPr>
+        <w:t>(a) Laboratory methods for 25(OH)D quantification. (b) Maternal 25(OH)D concentrations by continent. Dashed red line = 50 nmol/L sufficiency threshold.</w:t>
+      </w:r>
+    </w:p>
+    <w:p>
+      <w:pPr>
+        <w:jc w:val="center"/>
+      </w:pPr>
+      <w:r>
+        <w:drawing>
+          <wp:inline xmlns:a="http://schemas.openxmlformats.org/drawingml/2006/main" xmlns:pic="http://schemas.openxmlformats.org/drawingml/2006/picture">
+            <wp:extent cx="5943600" cy="4622800"/>
+            <wp:docPr id="8" name="Picture 8"/>
+            <wp:cNvGraphicFramePr>
+              <a:graphicFrameLocks noChangeAspect="1"/>
+            </wp:cNvGraphicFramePr>
+            <a:graphic>
+              <a:graphicData uri="http://schemas.openxmlformats.org/drawingml/2006/picture">
+                <pic:pic>
+                  <pic:nvPicPr>
+                    <pic:cNvPr id="0" name="Quality_JBI_NOS.png"/>
+                    <pic:cNvPicPr/>
+                  </pic:nvPicPr>
+                  <pic:blipFill>
+                    <a:blip r:embed="rId16"/>
+                    <a:stretch>
+                      <a:fillRect/>
+                    </a:stretch>
+                  </pic:blipFill>
+                  <pic:spPr>
+                    <a:xfrm>
+                      <a:off x="0" y="0"/>
+                      <a:ext cx="5943600" cy="4622800"/>
+                    </a:xfrm>
+                    <a:prstGeom prst="rect"/>
+                  </pic:spPr>
+                </pic:pic>
+              </a:graphicData>
+            </a:graphic>
+          </wp:inline>
+        </w:drawing>
+      </w:r>
+    </w:p>
+    <w:p>
+      <w:pPr>
+        <w:spacing w:before="120" w:after="320"/>
+        <w:jc w:val="left"/>
+      </w:pPr>
+      <w:r>
+        <w:rPr>
+          <w:rFonts w:ascii="Times New Roman" w:hAnsi="Times New Roman"/>
+          <w:b/>
+          <w:i w:val="0"/>
+          <w:sz w:val="22"/>
+        </w:rPr>
+        <w:t xml:space="preserve">Figure S3. </w:t>
+      </w:r>
+      <w:r>
+        <w:rPr>
+          <w:rFonts w:ascii="Times New Roman" w:hAnsi="Times New Roman"/>
+          <w:b w:val="0"/>
+          <w:i/>
+          <w:sz w:val="22"/>
+        </w:rPr>
+        <w:t>Methodological quality: (a) JBI Critical Appraisal heatmap (Q1–Q9). (b) Newcastle–Ottawa Scale scores. Dashed red line = NOS ≥ 7 (high quality).</w:t>
+      </w:r>
+    </w:p>
+    <w:p>
+      <w:pPr>
+        <w:jc w:val="center"/>
+      </w:pPr>
+      <w:r>
+        <w:drawing>
+          <wp:inline xmlns:a="http://schemas.openxmlformats.org/drawingml/2006/main" xmlns:pic="http://schemas.openxmlformats.org/drawingml/2006/picture">
+            <wp:extent cx="5943600" cy="2122714"/>
+            <wp:docPr id="9" name="Picture 9"/>
+            <wp:cNvGraphicFramePr>
+              <a:graphicFrameLocks noChangeAspect="1"/>
+            </wp:cNvGraphicFramePr>
+            <a:graphic>
+              <a:graphicData uri="http://schemas.openxmlformats.org/drawingml/2006/picture">
+                <pic:pic>
+                  <pic:nvPicPr>
+                    <pic:cNvPr id="0" name="LOO_Sensitivity.png"/>
+                    <pic:cNvPicPr/>
+                  </pic:nvPicPr>
+                  <pic:blipFill>
+                    <a:blip r:embed="rId17"/>
+                    <a:stretch>
+                      <a:fillRect/>
+                    </a:stretch>
+                  </pic:blipFill>
+                  <pic:spPr>
+                    <a:xfrm>
+                      <a:off x="0" y="0"/>
+                      <a:ext cx="5943600" cy="2122714"/>
+                    </a:xfrm>
+                    <a:prstGeom prst="rect"/>
+                  </pic:spPr>
+                </pic:pic>
+              </a:graphicData>
+            </a:graphic>
+          </wp:inline>
+        </w:drawing>
+      </w:r>
+    </w:p>
+    <w:p>
+      <w:pPr>
+        <w:spacing w:before="120" w:after="320"/>
+        <w:jc w:val="left"/>
+      </w:pPr>
+      <w:r>
+        <w:rPr>
+          <w:rFonts w:ascii="Times New Roman" w:hAnsi="Times New Roman"/>
+          <w:b/>
+          <w:i w:val="0"/>
+          <w:sz w:val="22"/>
+        </w:rPr>
+        <w:t xml:space="preserve">Figure S4. </w:t>
+      </w:r>
+      <w:r>
+        <w:rPr>
+          <w:rFonts w:ascii="Times New Roman" w:hAnsi="Times New Roman"/>
+          <w:b w:val="0"/>
+          <w:i/>
+          <w:sz w:val="22"/>
+        </w:rPr>
+        <w:t>Leave-one-out sensitivity analysis for SGA/FGR meta-analysis. Dashed line = overall pooled estimate. All estimates remain statistically significant.</w:t>
+      </w:r>
+    </w:p>
+    <w:p>
+      <w:pPr>
+        <w:jc w:val="center"/>
+      </w:pPr>
+      <w:r>
+        <w:drawing>
+          <wp:inline xmlns:a="http://schemas.openxmlformats.org/drawingml/2006/main" xmlns:pic="http://schemas.openxmlformats.org/drawingml/2006/picture">
+            <wp:extent cx="5943600" cy="2724150"/>
+            <wp:docPr id="10" name="Picture 10"/>
+            <wp:cNvGraphicFramePr>
+              <a:graphicFrameLocks noChangeAspect="1"/>
+            </wp:cNvGraphicFramePr>
+            <a:graphic>
+              <a:graphicData uri="http://schemas.openxmlformats.org/drawingml/2006/picture">
+                <pic:pic>
+                  <pic:nvPicPr>
+                    <pic:cNvPr id="0" name="Cutoff_Subgroup.png"/>
+                    <pic:cNvPicPr/>
+                  </pic:nvPicPr>
+                  <pic:blipFill>
+                    <a:blip r:embed="rId18"/>
+                    <a:stretch>
+                      <a:fillRect/>
+                    </a:stretch>
+                  </pic:blipFill>
+                  <pic:spPr>
+                    <a:xfrm>
+                      <a:off x="0" y="0"/>
+                      <a:ext cx="5943600" cy="2724150"/>
+                    </a:xfrm>
+                    <a:prstGeom prst="rect"/>
+                  </pic:spPr>
+                </pic:pic>
+              </a:graphicData>
+            </a:graphic>
+          </wp:inline>
+        </w:drawing>
+      </w:r>
+    </w:p>
+    <w:p>
+      <w:pPr>
+        <w:spacing w:before="120" w:after="320"/>
+        <w:jc w:val="left"/>
+      </w:pPr>
+      <w:r>
+        <w:rPr>
+          <w:rFonts w:ascii="Times New Roman" w:hAnsi="Times New Roman"/>
+          <w:b/>
+          <w:i w:val="0"/>
+          <w:sz w:val="22"/>
+        </w:rPr>
+        <w:t xml:space="preserve">Figure S5. </w:t>
+      </w:r>
+      <w:r>
+        <w:rPr>
+          <w:rFonts w:ascii="Times New Roman" w:hAnsi="Times New Roman"/>
+          <w:b w:val="0"/>
+          <w:i/>
+          <w:sz w:val="22"/>
+        </w:rPr>
+        <w:t>Subgroup forest plot stratified by vitamin D deficiency threshold. Diamond = overall pooled estimate. All subgroups directionally consistent.</w:t>
+      </w:r>
+    </w:p>
+    <w:p>
+      <w:pPr>
+        <w:jc w:val="center"/>
+      </w:pPr>
+      <w:r>
+        <w:drawing>
+          <wp:inline xmlns:a="http://schemas.openxmlformats.org/drawingml/2006/main" xmlns:pic="http://schemas.openxmlformats.org/drawingml/2006/picture">
+            <wp:extent cx="5029200" cy="4470400"/>
+            <wp:docPr id="11" name="Picture 11"/>
+            <wp:cNvGraphicFramePr>
+              <a:graphicFrameLocks noChangeAspect="1"/>
+            </wp:cNvGraphicFramePr>
+            <a:graphic>
+              <a:graphicData uri="http://schemas.openxmlformats.org/drawingml/2006/picture">
+                <pic:pic>
+                  <pic:nvPicPr>
+                    <pic:cNvPr id="0" name="Funnel_TrimFill.png"/>
+                    <pic:cNvPicPr/>
+                  </pic:nvPicPr>
+                  <pic:blipFill>
+                    <a:blip r:embed="rId19"/>
+                    <a:stretch>
+                      <a:fillRect/>
+                    </a:stretch>
+                  </pic:blipFill>
+                  <pic:spPr>
+                    <a:xfrm>
+                      <a:off x="0" y="0"/>
+                      <a:ext cx="5029200" cy="4470400"/>
+                    </a:xfrm>
+                    <a:prstGeom prst="rect"/>
+                  </pic:spPr>
+                </pic:pic>
+              </a:graphicData>
+            </a:graphic>
+          </wp:inline>
+        </w:drawing>
+      </w:r>
+    </w:p>
+    <w:p>
+      <w:pPr>
+        <w:spacing w:before="120" w:after="320"/>
+        <w:jc w:val="left"/>
+      </w:pPr>
+      <w:r>
+        <w:rPr>
+          <w:rFonts w:ascii="Times New Roman" w:hAnsi="Times New Roman"/>
+          <w:b/>
+          <w:i w:val="0"/>
+          <w:sz w:val="22"/>
+        </w:rPr>
+        <w:t xml:space="preserve">Figure S6. </w:t>
+      </w:r>
+      <w:r>
+        <w:rPr>
+          <w:rFonts w:ascii="Times New Roman" w:hAnsi="Times New Roman"/>
+          <w:b w:val="0"/>
+          <w:i/>
+          <w:sz w:val="22"/>
+        </w:rPr>
+        <w:t>Funnel plot with Duval &amp; Tweedie trim-and-fill analysis for SGA/FGR. Navy squares = observed; red open square = imputed.</w:t>
+      </w:r>
+    </w:p>
+    <w:p>
+      <w:pPr>
+        <w:jc w:val="center"/>
+      </w:pPr>
+      <w:r>
+        <w:drawing>
+          <wp:inline xmlns:a="http://schemas.openxmlformats.org/drawingml/2006/main" xmlns:pic="http://schemas.openxmlformats.org/drawingml/2006/picture">
+            <wp:extent cx="5943600" cy="3200400"/>
+            <wp:docPr id="12" name="Picture 12"/>
+            <wp:cNvGraphicFramePr>
+              <a:graphicFrameLocks noChangeAspect="1"/>
+            </wp:cNvGraphicFramePr>
+            <a:graphic>
+              <a:graphicData uri="http://schemas.openxmlformats.org/drawingml/2006/picture">
+                <pic:pic>
+                  <pic:nvPicPr>
+                    <pic:cNvPr id="0" name="BubblePlot.png"/>
+                    <pic:cNvPicPr/>
+                  </pic:nvPicPr>
+                  <pic:blipFill>
+                    <a:blip r:embed="rId20"/>
+                    <a:stretch>
+                      <a:fillRect/>
+                    </a:stretch>
+                  </pic:blipFill>
+                  <pic:spPr>
+                    <a:xfrm>
+                      <a:off x="0" y="0"/>
+                      <a:ext cx="5943600" cy="3200400"/>
+                    </a:xfrm>
+                    <a:prstGeom prst="rect"/>
+                  </pic:spPr>
+                </pic:pic>
+              </a:graphicData>
+            </a:graphic>
+          </wp:inline>
+        </w:drawing>
+      </w:r>
+    </w:p>
+    <w:p>
+      <w:pPr>
+        <w:spacing w:before="120" w:after="320"/>
+        <w:jc w:val="left"/>
+      </w:pPr>
+      <w:r>
+        <w:rPr>
+          <w:rFonts w:ascii="Times New Roman" w:hAnsi="Times New Roman"/>
+          <w:b/>
+          <w:i w:val="0"/>
+          <w:sz w:val="22"/>
+        </w:rPr>
+        <w:t xml:space="preserve">Figure S7. </w:t>
+      </w:r>
+      <w:r>
+        <w:rPr>
+          <w:rFonts w:ascii="Times New Roman" w:hAnsi="Times New Roman"/>
+          <w:b w:val="0"/>
+          <w:i/>
+          <w:sz w:val="22"/>
+        </w:rPr>
+        <w:t>Bubble plot: mean maternal 25(OH)D vs sample size. Dashed red line = 50 nmol/L sufficiency threshold.</w:t>
+      </w:r>
+    </w:p>
+    <w:p>
+      <w:pPr>
+        <w:jc w:val="center"/>
+      </w:pPr>
+      <w:r>
+        <w:drawing>
+          <wp:inline xmlns:a="http://schemas.openxmlformats.org/drawingml/2006/main" xmlns:pic="http://schemas.openxmlformats.org/drawingml/2006/picture">
+            <wp:extent cx="5943600" cy="6438900"/>
+            <wp:docPr id="13" name="Picture 13"/>
+            <wp:cNvGraphicFramePr>
+              <a:graphicFrameLocks noChangeAspect="1"/>
+            </wp:cNvGraphicFramePr>
+            <a:graphic>
+              <a:graphicData uri="http://schemas.openxmlformats.org/drawingml/2006/picture">
+                <pic:pic>
+                  <pic:nvPicPr>
+                    <pic:cNvPr id="0" name="Narrative_Synthesis.png"/>
+                    <pic:cNvPicPr/>
+                  </pic:nvPicPr>
+                  <pic:blipFill>
+                    <a:blip r:embed="rId21"/>
+                    <a:stretch>
+                      <a:fillRect/>
+                    </a:stretch>
+                  </pic:blipFill>
+                  <pic:spPr>
+                    <a:xfrm>
+                      <a:off x="0" y="0"/>
+                      <a:ext cx="5943600" cy="6438900"/>
+                    </a:xfrm>
+                    <a:prstGeom prst="rect"/>
+                  </pic:spPr>
+                </pic:pic>
+              </a:graphicData>
+            </a:graphic>
+          </wp:inline>
+        </w:drawing>
+      </w:r>
+    </w:p>
+    <w:p>
+      <w:pPr>
+        <w:spacing w:before="120" w:after="320"/>
+        <w:jc w:val="left"/>
+      </w:pPr>
+      <w:r>
+        <w:rPr>
+          <w:rFonts w:ascii="Times New Roman" w:hAnsi="Times New Roman"/>
+          <w:b/>
+          <w:i w:val="0"/>
+          <w:sz w:val="22"/>
+        </w:rPr>
+        <w:t xml:space="preserve">Figure S8. </w:t>
+      </w:r>
+      <w:r>
+        <w:rPr>
+          <w:rFonts w:ascii="Times New Roman" w:hAnsi="Times New Roman"/>
+          <w:b w:val="0"/>
+          <w:i/>
+          <w:sz w:val="22"/>
+        </w:rPr>
+        <w:t>Narrative synthesis heatmap: direction of association and quality (NOS/RoB) for all 26 studies.</w:t>
+      </w:r>
+    </w:p>
+    <w:p>
+      <w:pPr>
+        <w:jc w:val="center"/>
+      </w:pPr>
+      <w:r>
+        <w:drawing>
+          <wp:inline xmlns:a="http://schemas.openxmlformats.org/drawingml/2006/main" xmlns:pic="http://schemas.openxmlformats.org/drawingml/2006/picture">
+            <wp:extent cx="5943600" cy="2971800"/>
+            <wp:docPr id="14" name="Picture 14"/>
+            <wp:cNvGraphicFramePr>
+              <a:graphicFrameLocks noChangeAspect="1"/>
+            </wp:cNvGraphicFramePr>
+            <a:graphic>
+              <a:graphicData uri="http://schemas.openxmlformats.org/drawingml/2006/picture">
+                <pic:pic>
+                  <pic:nvPicPr>
+                    <pic:cNvPr id="0" name="Outcome_CutoffSummary.png"/>
+                    <pic:cNvPicPr/>
+                  </pic:nvPicPr>
+                  <pic:blipFill>
+                    <a:blip r:embed="rId22"/>
+                    <a:stretch>
+                      <a:fillRect/>
+                    </a:stretch>
+                  </pic:blipFill>
+                  <pic:spPr>
+                    <a:xfrm>
+                      <a:off x="0" y="0"/>
+                      <a:ext cx="5943600" cy="2971800"/>
+                    </a:xfrm>
+                    <a:prstGeom prst="rect"/>
+                  </pic:spPr>
+                </pic:pic>
+              </a:graphicData>
+            </a:graphic>
+          </wp:inline>
+        </w:drawing>
+      </w:r>
+    </w:p>
+    <w:p>
+      <w:pPr>
+        <w:spacing w:before="120" w:after="320"/>
+        <w:jc w:val="left"/>
+      </w:pPr>
+      <w:r>
+        <w:rPr>
+          <w:rFonts w:ascii="Times New Roman" w:hAnsi="Times New Roman"/>
+          <w:b/>
+          <w:i w:val="0"/>
+          <w:sz w:val="22"/>
+        </w:rPr>
+        <w:t xml:space="preserve">Figure S9. </w:t>
+      </w:r>
+      <w:r>
+        <w:rPr>
+          <w:rFonts w:ascii="Times New Roman" w:hAnsi="Times New Roman"/>
+          <w:b w:val="0"/>
+          <w:i/>
+          <w:sz w:val="22"/>
+        </w:rPr>
+        <w:t>(a) Outcome categories by significance. (b) Vitamin D deficiency threshold distribution.</w:t>
+      </w:r>
+    </w:p>
     <w:p/>
     <w:p>
       <w:r>

</xml_diff>